<commit_message>
Added work forLab 6
</commit_message>
<xml_diff>
--- a/Lab-6_Operational-Amplifiers-Applications/Lab-6_Operational-Amplifiers-Applications.docx
+++ b/Lab-6_Operational-Amplifiers-Applications/Lab-6_Operational-Amplifiers-Applications.docx
@@ -218,15 +218,7 @@
           <w:sz w:val="28"/>
           <w:szCs w:val="28"/>
         </w:rPr>
-        <w:t>L</w:t>
-      </w:r>
-      <w:r>
-        <w:rPr>
-          <w:rFonts w:ascii="Times New Roman" w:hAnsi="Times New Roman" w:cs="Times New Roman"/>
-          <w:sz w:val="28"/>
-          <w:szCs w:val="28"/>
-        </w:rPr>
-        <w:t>aptop with LTSpice</w:t>
+        <w:t>Laptop with LTSpice</w:t>
       </w:r>
     </w:p>
     <w:p>
@@ -417,6 +409,7 @@
       <w:r>
         <w:rPr>
           <w:rFonts w:ascii="Times New Roman" w:hAnsi="Times New Roman" w:cs="Times New Roman"/>
+          <w:noProof/>
           <w:sz w:val="28"/>
           <w:szCs w:val="28"/>
         </w:rPr>
@@ -471,24 +464,14 @@
       <w:r>
         <w:t xml:space="preserve">Figure </w:t>
       </w:r>
-      <w:r>
-        <w:fldChar w:fldCharType="begin"/>
-      </w:r>
-      <w:r>
-        <w:instrText xml:space="preserve"> SEQ Figure \* ARABIC </w:instrText>
-      </w:r>
-      <w:r>
-        <w:fldChar w:fldCharType="separate"/>
-      </w:r>
-      <w:r>
-        <w:rPr>
-          <w:noProof/>
-        </w:rPr>
-        <w:t>1</w:t>
-      </w:r>
-      <w:r>
-        <w:fldChar w:fldCharType="end"/>
-      </w:r>
+      <w:fldSimple w:instr=" SEQ Figure \* ARABIC ">
+        <w:r>
+          <w:rPr>
+            <w:noProof/>
+          </w:rPr>
+          <w:t>1</w:t>
+        </w:r>
+      </w:fldSimple>
       <w:r>
         <w:t xml:space="preserve">: </w:t>
       </w:r>
@@ -1243,15 +1226,7 @@
                           <w:sz w:val="28"/>
                           <w:szCs w:val="28"/>
                         </w:rPr>
-                        <m:t>+</m:t>
-                      </m:r>
-                      <m:r>
-                        <w:rPr>
-                          <w:rFonts w:ascii="Cambria Math" w:hAnsi="Cambria Math" w:cs="Times New Roman"/>
-                          <w:sz w:val="28"/>
-                          <w:szCs w:val="28"/>
-                        </w:rPr>
-                        <m:t>R</m:t>
+                        <m:t>+R</m:t>
                       </m:r>
                     </m:e>
                     <m:sub>
@@ -1529,23 +1504,7 @@
               <w:sz w:val="28"/>
               <w:szCs w:val="28"/>
             </w:rPr>
-            <m:t xml:space="preserve">                     (6.</m:t>
-          </m:r>
-          <m:r>
-            <w:rPr>
-              <w:rFonts w:ascii="Cambria Math" w:hAnsi="Cambria Math" w:cs="Times New Roman"/>
-              <w:sz w:val="28"/>
-              <w:szCs w:val="28"/>
-            </w:rPr>
-            <m:t>2</m:t>
-          </m:r>
-          <m:r>
-            <w:rPr>
-              <w:rFonts w:ascii="Cambria Math" w:hAnsi="Cambria Math" w:cs="Times New Roman"/>
-              <w:sz w:val="28"/>
-              <w:szCs w:val="28"/>
-            </w:rPr>
-            <m:t>)</m:t>
+            <m:t xml:space="preserve">                     (6.2)</m:t>
           </m:r>
         </m:oMath>
       </m:oMathPara>
@@ -1911,6 +1870,7 @@
       <w:r>
         <w:rPr>
           <w:rFonts w:ascii="Times New Roman" w:hAnsi="Times New Roman" w:cs="Times New Roman"/>
+          <w:noProof/>
           <w:sz w:val="28"/>
           <w:szCs w:val="28"/>
         </w:rPr>
@@ -1964,24 +1924,14 @@
       <w:r>
         <w:t xml:space="preserve">Figure </w:t>
       </w:r>
-      <w:r>
-        <w:fldChar w:fldCharType="begin"/>
-      </w:r>
-      <w:r>
-        <w:instrText xml:space="preserve"> SEQ Figure \* ARABIC </w:instrText>
-      </w:r>
-      <w:r>
-        <w:fldChar w:fldCharType="separate"/>
-      </w:r>
-      <w:r>
-        <w:rPr>
-          <w:noProof/>
-        </w:rPr>
-        <w:t>2</w:t>
-      </w:r>
-      <w:r>
-        <w:fldChar w:fldCharType="end"/>
-      </w:r>
+      <w:fldSimple w:instr=" SEQ Figure \* ARABIC ">
+        <w:r>
+          <w:rPr>
+            <w:noProof/>
+          </w:rPr>
+          <w:t>2</w:t>
+        </w:r>
+      </w:fldSimple>
       <w:r>
         <w:t>:</w:t>
       </w:r>
@@ -2129,6 +2079,7 @@
       <w:r>
         <w:rPr>
           <w:rFonts w:ascii="Times New Roman" w:hAnsi="Times New Roman" w:cs="Times New Roman"/>
+          <w:noProof/>
           <w:sz w:val="24"/>
           <w:szCs w:val="24"/>
         </w:rPr>
@@ -2182,24 +2133,14 @@
       <w:r>
         <w:t xml:space="preserve">Figure </w:t>
       </w:r>
-      <w:r>
-        <w:fldChar w:fldCharType="begin"/>
-      </w:r>
-      <w:r>
-        <w:instrText xml:space="preserve"> SEQ Figure \* ARABIC </w:instrText>
-      </w:r>
-      <w:r>
-        <w:fldChar w:fldCharType="separate"/>
-      </w:r>
-      <w:r>
-        <w:rPr>
-          <w:noProof/>
-        </w:rPr>
-        <w:t>3</w:t>
-      </w:r>
-      <w:r>
-        <w:fldChar w:fldCharType="end"/>
-      </w:r>
+      <w:fldSimple w:instr=" SEQ Figure \* ARABIC ">
+        <w:r>
+          <w:rPr>
+            <w:noProof/>
+          </w:rPr>
+          <w:t>3</w:t>
+        </w:r>
+      </w:fldSimple>
       <w:r>
         <w:t xml:space="preserve">: </w:t>
       </w:r>
@@ -2291,6 +2232,7 @@
       <w:r>
         <w:rPr>
           <w:rFonts w:ascii="Times New Roman" w:hAnsi="Times New Roman" w:cs="Times New Roman"/>
+          <w:noProof/>
           <w:sz w:val="28"/>
           <w:szCs w:val="28"/>
         </w:rPr>
@@ -2342,24 +2284,14 @@
       <w:r>
         <w:t xml:space="preserve">Screenshot </w:t>
       </w:r>
-      <w:r>
-        <w:fldChar w:fldCharType="begin"/>
-      </w:r>
-      <w:r>
-        <w:instrText xml:space="preserve"> SEQ Screenshot \* ARABIC </w:instrText>
-      </w:r>
-      <w:r>
-        <w:fldChar w:fldCharType="separate"/>
-      </w:r>
-      <w:r>
-        <w:rPr>
-          <w:noProof/>
-        </w:rPr>
-        <w:t>1</w:t>
-      </w:r>
-      <w:r>
-        <w:fldChar w:fldCharType="end"/>
-      </w:r>
+      <w:fldSimple w:instr=" SEQ Screenshot \* ARABIC ">
+        <w:r>
+          <w:rPr>
+            <w:noProof/>
+          </w:rPr>
+          <w:t>1</w:t>
+        </w:r>
+      </w:fldSimple>
       <w:r>
         <w:t xml:space="preserve">: </w:t>
       </w:r>
@@ -2647,24 +2579,14 @@
       <w:r>
         <w:t xml:space="preserve">Table </w:t>
       </w:r>
-      <w:r>
-        <w:fldChar w:fldCharType="begin"/>
-      </w:r>
-      <w:r>
-        <w:instrText xml:space="preserve"> SEQ Table \* ARABIC </w:instrText>
-      </w:r>
-      <w:r>
-        <w:fldChar w:fldCharType="separate"/>
-      </w:r>
-      <w:r>
-        <w:rPr>
-          <w:noProof/>
-        </w:rPr>
-        <w:t>1</w:t>
-      </w:r>
-      <w:r>
-        <w:fldChar w:fldCharType="end"/>
-      </w:r>
+      <w:fldSimple w:instr=" SEQ Table \* ARABIC ">
+        <w:r>
+          <w:rPr>
+            <w:noProof/>
+          </w:rPr>
+          <w:t>1</w:t>
+        </w:r>
+      </w:fldSimple>
       <w:r>
         <w:t>: Tabled Values of Figure 6.3 LTspice circuits</w:t>
       </w:r>
@@ -2794,39 +2716,7 @@
           <w:sz w:val="28"/>
           <w:szCs w:val="28"/>
         </w:rPr>
-        <w:t xml:space="preserve"> is 1.67 V because the 1k</w:t>
-      </w:r>
-      <w:r>
-        <w:rPr>
-          <w:rFonts w:ascii="Times New Roman" w:hAnsi="Times New Roman" w:cs="Times New Roman"/>
-          <w:sz w:val="28"/>
-          <w:szCs w:val="28"/>
-        </w:rPr>
-        <w:t>Ω</w:t>
-      </w:r>
-      <w:r>
-        <w:rPr>
-          <w:rFonts w:ascii="Times New Roman" w:hAnsi="Times New Roman" w:cs="Times New Roman"/>
-          <w:sz w:val="28"/>
-          <w:szCs w:val="28"/>
-        </w:rPr>
-        <w:t xml:space="preserve"> load is parallel with the bottom 1kΩ resistor of the divider, creating an equivalent resistance of 500</w:t>
-      </w:r>
-      <w:r>
-        <w:rPr>
-          <w:rFonts w:ascii="Times New Roman" w:hAnsi="Times New Roman" w:cs="Times New Roman"/>
-          <w:sz w:val="28"/>
-          <w:szCs w:val="28"/>
-        </w:rPr>
-        <w:t>Ω</w:t>
-      </w:r>
-      <w:r>
-        <w:rPr>
-          <w:rFonts w:ascii="Times New Roman" w:hAnsi="Times New Roman" w:cs="Times New Roman"/>
-          <w:sz w:val="28"/>
-          <w:szCs w:val="28"/>
-        </w:rPr>
-        <w:t xml:space="preserve"> and so it draws more current from the top half of the divider. </w:t>
+        <w:t xml:space="preserve"> is 1.67 V because the 1kΩ load is parallel with the bottom 1kΩ resistor of the divider, creating an equivalent resistance of 500Ω and so it draws more current from the top half of the divider. </w:t>
       </w:r>
     </w:p>
     <w:p>
@@ -2896,6 +2786,7 @@
       <w:r>
         <w:rPr>
           <w:rFonts w:ascii="Times New Roman" w:hAnsi="Times New Roman" w:cs="Times New Roman"/>
+          <w:noProof/>
           <w:sz w:val="28"/>
           <w:szCs w:val="28"/>
         </w:rPr>
@@ -2949,24 +2840,14 @@
       <w:r>
         <w:t xml:space="preserve">Figure </w:t>
       </w:r>
-      <w:r>
-        <w:fldChar w:fldCharType="begin"/>
-      </w:r>
-      <w:r>
-        <w:instrText xml:space="preserve"> SEQ Figure \* ARABIC </w:instrText>
-      </w:r>
-      <w:r>
-        <w:fldChar w:fldCharType="separate"/>
-      </w:r>
-      <w:r>
-        <w:rPr>
-          <w:noProof/>
-        </w:rPr>
-        <w:t>4</w:t>
-      </w:r>
-      <w:r>
-        <w:fldChar w:fldCharType="end"/>
-      </w:r>
+      <w:fldSimple w:instr=" SEQ Figure \* ARABIC ">
+        <w:r>
+          <w:rPr>
+            <w:noProof/>
+          </w:rPr>
+          <w:t>4</w:t>
+        </w:r>
+      </w:fldSimple>
       <w:r>
         <w:t xml:space="preserve">: </w:t>
       </w:r>
@@ -3023,6 +2904,7 @@
       <w:r>
         <w:rPr>
           <w:rFonts w:ascii="Times New Roman" w:hAnsi="Times New Roman" w:cs="Times New Roman"/>
+          <w:noProof/>
           <w:sz w:val="28"/>
           <w:szCs w:val="28"/>
         </w:rPr>
@@ -3074,24 +2956,14 @@
       <w:r>
         <w:t xml:space="preserve">Screenshot </w:t>
       </w:r>
-      <w:r>
-        <w:fldChar w:fldCharType="begin"/>
-      </w:r>
-      <w:r>
-        <w:instrText xml:space="preserve"> SEQ Screenshot \* ARABIC </w:instrText>
-      </w:r>
-      <w:r>
-        <w:fldChar w:fldCharType="separate"/>
-      </w:r>
-      <w:r>
-        <w:rPr>
-          <w:noProof/>
-        </w:rPr>
-        <w:t>2</w:t>
-      </w:r>
-      <w:r>
-        <w:fldChar w:fldCharType="end"/>
-      </w:r>
+      <w:fldSimple w:instr=" SEQ Screenshot \* ARABIC ">
+        <w:r>
+          <w:rPr>
+            <w:noProof/>
+          </w:rPr>
+          <w:t>2</w:t>
+        </w:r>
+      </w:fldSimple>
       <w:r>
         <w:t xml:space="preserve">: </w:t>
       </w:r>
@@ -3099,13 +2971,7 @@
         <w:rPr>
           <w:rFonts w:cstheme="minorHAnsi"/>
         </w:rPr>
-        <w:t xml:space="preserve"> </w:t>
-      </w:r>
-      <w:r>
-        <w:rPr>
-          <w:rFonts w:cstheme="minorHAnsi"/>
-        </w:rPr>
-        <w:t>Figure 6.4 (a) using a transient analysis with a stop time of 1m (.tran 1m)</w:t>
+        <w:t xml:space="preserve"> Figure 6.4 (a) using a transient analysis with a stop time of 1m (.tran 1m)</w:t>
       </w:r>
       <w:r>
         <w:rPr>
@@ -3194,7 +3060,23 @@
           <w:sz w:val="28"/>
           <w:szCs w:val="28"/>
         </w:rPr>
-        <w:t>Practically, a 2.5 V reference may not be available for use and instead must be selfgenerated. Simulate the circuit in Figure 6.4 (b) using a transient analysis with a stop time of 1m (.tran 1m). Set V</w:t>
+        <w:t xml:space="preserve">Practically, a 2.5 V reference may not be available for use and instead must be </w:t>
+      </w:r>
+      <w:r>
+        <w:rPr>
+          <w:rFonts w:ascii="Times New Roman" w:hAnsi="Times New Roman" w:cs="Times New Roman"/>
+          <w:sz w:val="28"/>
+          <w:szCs w:val="28"/>
+        </w:rPr>
+        <w:t>self-generated</w:t>
+      </w:r>
+      <w:r>
+        <w:rPr>
+          <w:rFonts w:ascii="Times New Roman" w:hAnsi="Times New Roman" w:cs="Times New Roman"/>
+          <w:sz w:val="28"/>
+          <w:szCs w:val="28"/>
+        </w:rPr>
+        <w:t>. Simulate the circuit in Figure 6.4 (b) using a transient analysis with a stop time of 1m (.tran 1m). Set V</w:t>
       </w:r>
       <w:r>
         <w:rPr>
@@ -3223,6 +3105,7 @@
       <w:r>
         <w:rPr>
           <w:rFonts w:ascii="Times New Roman" w:hAnsi="Times New Roman" w:cs="Times New Roman"/>
+          <w:noProof/>
           <w:sz w:val="28"/>
           <w:szCs w:val="28"/>
         </w:rPr>
@@ -3276,24 +3159,14 @@
       <w:r>
         <w:t xml:space="preserve">Screenshot </w:t>
       </w:r>
-      <w:r>
-        <w:fldChar w:fldCharType="begin"/>
-      </w:r>
-      <w:r>
-        <w:instrText xml:space="preserve"> SEQ Screenshot \* ARABIC </w:instrText>
-      </w:r>
-      <w:r>
-        <w:fldChar w:fldCharType="separate"/>
-      </w:r>
-      <w:r>
-        <w:rPr>
-          <w:noProof/>
-        </w:rPr>
-        <w:t>3</w:t>
-      </w:r>
-      <w:r>
-        <w:fldChar w:fldCharType="end"/>
-      </w:r>
+      <w:fldSimple w:instr=" SEQ Screenshot \* ARABIC ">
+        <w:r>
+          <w:rPr>
+            <w:noProof/>
+          </w:rPr>
+          <w:t>3</w:t>
+        </w:r>
+      </w:fldSimple>
       <w:r>
         <w:t xml:space="preserve">: </w:t>
       </w:r>
@@ -3314,13 +3187,7 @@
         <w:rPr>
           <w:rFonts w:cstheme="minorHAnsi"/>
         </w:rPr>
-        <w:t xml:space="preserve"> to a sine wave with a 0 V DC offset, 2 V amplitude, and a 1 kHz frequency</w:t>
-      </w:r>
-      <w:r>
-        <w:rPr>
-          <w:rFonts w:cstheme="minorHAnsi"/>
-        </w:rPr>
-        <w:t xml:space="preserve"> with plotted input and output voltages.</w:t>
+        <w:t xml:space="preserve"> to a sine wave with a 0 V DC offset, 2 V amplitude, and a 1 kHz frequency with plotted input and output voltages.</w:t>
       </w:r>
     </w:p>
     <w:p>
@@ -3355,6 +3222,7 @@
       <w:r>
         <w:rPr>
           <w:rFonts w:ascii="Times New Roman" w:hAnsi="Times New Roman" w:cs="Times New Roman"/>
+          <w:noProof/>
           <w:sz w:val="28"/>
           <w:szCs w:val="28"/>
         </w:rPr>
@@ -3409,24 +3277,14 @@
       <w:r>
         <w:t xml:space="preserve">Screenshot </w:t>
       </w:r>
-      <w:r>
-        <w:fldChar w:fldCharType="begin"/>
-      </w:r>
-      <w:r>
-        <w:instrText xml:space="preserve"> SEQ Screenshot \* ARABIC </w:instrText>
-      </w:r>
-      <w:r>
-        <w:fldChar w:fldCharType="separate"/>
-      </w:r>
-      <w:r>
-        <w:rPr>
-          <w:noProof/>
-        </w:rPr>
-        <w:t>4</w:t>
-      </w:r>
-      <w:r>
-        <w:fldChar w:fldCharType="end"/>
-      </w:r>
+      <w:fldSimple w:instr=" SEQ Screenshot \* ARABIC ">
+        <w:r>
+          <w:rPr>
+            <w:noProof/>
+          </w:rPr>
+          <w:t>4</w:t>
+        </w:r>
+      </w:fldSimple>
       <w:r>
         <w:t xml:space="preserve">: </w:t>
       </w:r>
@@ -3450,6 +3308,9 @@
         <w:jc w:val="center"/>
       </w:pPr>
       <w:r>
+        <w:rPr>
+          <w:noProof/>
+        </w:rPr>
         <w:lastRenderedPageBreak/>
         <w:drawing>
           <wp:inline distT="0" distB="0" distL="0" distR="0" wp14:anchorId="25EB538C" wp14:editId="31BC0CEB">
@@ -3499,41 +3360,19 @@
       <w:r>
         <w:t xml:space="preserve">Screenshot </w:t>
       </w:r>
-      <w:r>
-        <w:fldChar w:fldCharType="begin"/>
-      </w:r>
-      <w:r>
-        <w:instrText xml:space="preserve"> SEQ Screenshot \* ARABIC </w:instrText>
-      </w:r>
-      <w:r>
-        <w:fldChar w:fldCharType="separate"/>
-      </w:r>
-      <w:r>
-        <w:rPr>
-          <w:noProof/>
-        </w:rPr>
-        <w:t>5</w:t>
-      </w:r>
-      <w:r>
-        <w:fldChar w:fldCharType="end"/>
-      </w:r>
+      <w:fldSimple w:instr=" SEQ Screenshot \* ARABIC ">
+        <w:r>
+          <w:rPr>
+            <w:noProof/>
+          </w:rPr>
+          <w:t>5</w:t>
+        </w:r>
+      </w:fldSimple>
       <w:r>
         <w:rPr>
           <w:rFonts w:cstheme="minorHAnsi"/>
         </w:rPr>
-        <w:t xml:space="preserve">: </w:t>
-      </w:r>
-      <w:r>
-        <w:rPr>
-          <w:rFonts w:cstheme="minorHAnsi"/>
-        </w:rPr>
-        <w:t xml:space="preserve">Figure 6.4 (b) on a breadboard. Configure the Wavegen to generate a sine wave at 1 kHz with a 2 V amplitude and a 0 V offset. </w:t>
-      </w:r>
-      <w:r>
-        <w:rPr>
-          <w:rFonts w:cstheme="minorHAnsi"/>
-        </w:rPr>
-        <w:t>CH1 is input CH2 is output</w:t>
+        <w:t>: Figure 6.4 (b) on a breadboard. Configure the Wavegen to generate a sine wave at 1 kHz with a 2 V amplitude and a 0 V offset. CH1 is input CH2 is output</w:t>
       </w:r>
     </w:p>
     <w:p>
@@ -3866,6 +3705,7 @@
       <w:r>
         <w:rPr>
           <w:rFonts w:ascii="Times New Roman" w:hAnsi="Times New Roman" w:cs="Times New Roman"/>
+          <w:noProof/>
           <w:sz w:val="28"/>
           <w:szCs w:val="28"/>
         </w:rPr>
@@ -3915,24 +3755,14 @@
       <w:r>
         <w:t xml:space="preserve">Figure </w:t>
       </w:r>
-      <w:r>
-        <w:fldChar w:fldCharType="begin"/>
-      </w:r>
-      <w:r>
-        <w:instrText xml:space="preserve"> SEQ Figure \* ARABIC </w:instrText>
-      </w:r>
-      <w:r>
-        <w:fldChar w:fldCharType="separate"/>
-      </w:r>
-      <w:r>
-        <w:rPr>
-          <w:noProof/>
-        </w:rPr>
-        <w:t>5</w:t>
-      </w:r>
-      <w:r>
-        <w:fldChar w:fldCharType="end"/>
-      </w:r>
+      <w:fldSimple w:instr=" SEQ Figure \* ARABIC ">
+        <w:r>
+          <w:rPr>
+            <w:noProof/>
+          </w:rPr>
+          <w:t>5</w:t>
+        </w:r>
+      </w:fldSimple>
       <w:r>
         <w:t xml:space="preserve">: </w:t>
       </w:r>
@@ -3946,6 +3776,9 @@
         <w:jc w:val="center"/>
       </w:pPr>
       <w:r>
+        <w:rPr>
+          <w:noProof/>
+        </w:rPr>
         <w:lastRenderedPageBreak/>
         <w:drawing>
           <wp:inline distT="0" distB="0" distL="0" distR="0" wp14:anchorId="25EA2A2A" wp14:editId="18E2C9AD">
@@ -3992,24 +3825,14 @@
       <w:r>
         <w:t xml:space="preserve">Screenshot </w:t>
       </w:r>
-      <w:r>
-        <w:fldChar w:fldCharType="begin"/>
-      </w:r>
-      <w:r>
-        <w:instrText xml:space="preserve"> SEQ Screenshot \* ARABIC </w:instrText>
-      </w:r>
-      <w:r>
-        <w:fldChar w:fldCharType="separate"/>
-      </w:r>
-      <w:r>
-        <w:rPr>
-          <w:noProof/>
-        </w:rPr>
-        <w:t>6</w:t>
-      </w:r>
-      <w:r>
-        <w:fldChar w:fldCharType="end"/>
-      </w:r>
+      <w:fldSimple w:instr=" SEQ Screenshot \* ARABIC ">
+        <w:r>
+          <w:rPr>
+            <w:noProof/>
+          </w:rPr>
+          <w:t>6</w:t>
+        </w:r>
+      </w:fldSimple>
       <w:r>
         <w:t xml:space="preserve">: </w:t>
       </w:r>
@@ -4030,13 +3853,7 @@
         <w:rPr>
           <w:rFonts w:cstheme="minorHAnsi"/>
         </w:rPr>
-        <w:t xml:space="preserve"> to a sine wave with a 0 V DC offset, 5 V amplitude, and a 1 kHz frequenc</w:t>
-      </w:r>
-      <w:r>
-        <w:rPr>
-          <w:rFonts w:cstheme="minorHAnsi"/>
-        </w:rPr>
-        <w:t>y with plotted input and output voltages</w:t>
+        <w:t xml:space="preserve"> to a sine wave with a 0 V DC offset, 5 V amplitude, and a 1 kHz frequency with plotted input and output voltages</w:t>
       </w:r>
     </w:p>
     <w:p>
@@ -4108,6 +3925,7 @@
       <w:r>
         <w:rPr>
           <w:rFonts w:ascii="Times New Roman" w:hAnsi="Times New Roman" w:cs="Times New Roman"/>
+          <w:noProof/>
           <w:sz w:val="28"/>
           <w:szCs w:val="28"/>
         </w:rPr>
@@ -4162,24 +3980,14 @@
       <w:r>
         <w:t xml:space="preserve">Figure </w:t>
       </w:r>
-      <w:r>
-        <w:fldChar w:fldCharType="begin"/>
-      </w:r>
-      <w:r>
-        <w:instrText xml:space="preserve"> SEQ Figure \* ARABIC </w:instrText>
-      </w:r>
-      <w:r>
-        <w:fldChar w:fldCharType="separate"/>
-      </w:r>
-      <w:r>
-        <w:rPr>
-          <w:noProof/>
-        </w:rPr>
-        <w:t>6</w:t>
-      </w:r>
-      <w:r>
-        <w:fldChar w:fldCharType="end"/>
-      </w:r>
+      <w:fldSimple w:instr=" SEQ Figure \* ARABIC ">
+        <w:r>
+          <w:rPr>
+            <w:noProof/>
+          </w:rPr>
+          <w:t>6</w:t>
+        </w:r>
+      </w:fldSimple>
       <w:r>
         <w:t xml:space="preserve">: </w:t>
       </w:r>
@@ -4304,6 +4112,7 @@
       <w:r>
         <w:rPr>
           <w:rFonts w:ascii="Times New Roman" w:hAnsi="Times New Roman" w:cs="Times New Roman"/>
+          <w:noProof/>
           <w:sz w:val="28"/>
           <w:szCs w:val="28"/>
         </w:rPr>
@@ -4358,24 +4167,14 @@
       <w:r>
         <w:t xml:space="preserve">Screenshot </w:t>
       </w:r>
-      <w:r>
-        <w:fldChar w:fldCharType="begin"/>
-      </w:r>
-      <w:r>
-        <w:instrText xml:space="preserve"> SEQ Screenshot \* ARABIC </w:instrText>
-      </w:r>
-      <w:r>
-        <w:fldChar w:fldCharType="separate"/>
-      </w:r>
-      <w:r>
-        <w:rPr>
-          <w:noProof/>
-        </w:rPr>
-        <w:t>7</w:t>
-      </w:r>
-      <w:r>
-        <w:fldChar w:fldCharType="end"/>
-      </w:r>
+      <w:fldSimple w:instr=" SEQ Screenshot \* ARABIC ">
+        <w:r>
+          <w:rPr>
+            <w:noProof/>
+          </w:rPr>
+          <w:t>7</w:t>
+        </w:r>
+      </w:fldSimple>
     </w:p>
     <w:p>
       <w:pPr>
@@ -4638,23 +4437,7 @@
           <w:sz w:val="28"/>
           <w:szCs w:val="28"/>
         </w:rPr>
-        <w:t xml:space="preserve"> = 10k</w:t>
-      </w:r>
-      <w:r>
-        <w:rPr>
-          <w:rFonts w:ascii="Times New Roman" w:hAnsi="Times New Roman" w:cs="Times New Roman"/>
-          <w:sz w:val="28"/>
-          <w:szCs w:val="28"/>
-        </w:rPr>
-        <w:t>Ω</w:t>
-      </w:r>
-      <w:r>
-        <w:rPr>
-          <w:rFonts w:ascii="Times New Roman" w:hAnsi="Times New Roman" w:cs="Times New Roman"/>
-          <w:sz w:val="28"/>
-          <w:szCs w:val="28"/>
-        </w:rPr>
-        <w:t>, R</w:t>
+        <w:t xml:space="preserve"> = 10kΩ, R</w:t>
       </w:r>
       <w:r>
         <w:rPr>
@@ -4687,23 +4470,7 @@
           <w:sz w:val="28"/>
           <w:szCs w:val="28"/>
         </w:rPr>
-        <w:t>k</w:t>
-      </w:r>
-      <w:r>
-        <w:rPr>
-          <w:rFonts w:ascii="Times New Roman" w:hAnsi="Times New Roman" w:cs="Times New Roman"/>
-          <w:sz w:val="28"/>
-          <w:szCs w:val="28"/>
-        </w:rPr>
-        <w:t>Ω</w:t>
-      </w:r>
-      <w:r>
-        <w:rPr>
-          <w:rFonts w:ascii="Times New Roman" w:hAnsi="Times New Roman" w:cs="Times New Roman"/>
-          <w:sz w:val="28"/>
-          <w:szCs w:val="28"/>
-        </w:rPr>
-        <w:t>, R</w:t>
+        <w:t>kΩ, R</w:t>
       </w:r>
       <w:r>
         <w:rPr>
@@ -4736,23 +4503,7 @@
           <w:sz w:val="28"/>
           <w:szCs w:val="28"/>
         </w:rPr>
-        <w:t>k</w:t>
-      </w:r>
-      <w:r>
-        <w:rPr>
-          <w:rFonts w:ascii="Times New Roman" w:hAnsi="Times New Roman" w:cs="Times New Roman"/>
-          <w:sz w:val="28"/>
-          <w:szCs w:val="28"/>
-        </w:rPr>
-        <w:t>Ω</w:t>
-      </w:r>
-      <w:r>
-        <w:rPr>
-          <w:rFonts w:ascii="Times New Roman" w:hAnsi="Times New Roman" w:cs="Times New Roman"/>
-          <w:sz w:val="28"/>
-          <w:szCs w:val="28"/>
-        </w:rPr>
-        <w:t>, R</w:t>
+        <w:t>kΩ, R</w:t>
       </w:r>
       <w:r>
         <w:rPr>
@@ -4785,23 +4536,7 @@
           <w:sz w:val="28"/>
           <w:szCs w:val="28"/>
         </w:rPr>
-        <w:t>k</w:t>
-      </w:r>
-      <w:r>
-        <w:rPr>
-          <w:rFonts w:ascii="Times New Roman" w:hAnsi="Times New Roman" w:cs="Times New Roman"/>
-          <w:sz w:val="28"/>
-          <w:szCs w:val="28"/>
-        </w:rPr>
-        <w:t>Ω</w:t>
-      </w:r>
-      <w:r>
-        <w:rPr>
-          <w:rFonts w:ascii="Times New Roman" w:hAnsi="Times New Roman" w:cs="Times New Roman"/>
-          <w:sz w:val="28"/>
-          <w:szCs w:val="28"/>
-        </w:rPr>
-        <w:t>, R</w:t>
+        <w:t>kΩ, R</w:t>
       </w:r>
       <w:r>
         <w:rPr>
@@ -4834,23 +4569,7 @@
           <w:sz w:val="28"/>
           <w:szCs w:val="28"/>
         </w:rPr>
-        <w:t>k</w:t>
-      </w:r>
-      <w:r>
-        <w:rPr>
-          <w:rFonts w:ascii="Times New Roman" w:hAnsi="Times New Roman" w:cs="Times New Roman"/>
-          <w:sz w:val="28"/>
-          <w:szCs w:val="28"/>
-        </w:rPr>
-        <w:t>Ω</w:t>
-      </w:r>
-      <w:r>
-        <w:rPr>
-          <w:rFonts w:ascii="Times New Roman" w:hAnsi="Times New Roman" w:cs="Times New Roman"/>
-          <w:sz w:val="28"/>
-          <w:szCs w:val="28"/>
-        </w:rPr>
-        <w:t>, R</w:t>
+        <w:t>kΩ, R</w:t>
       </w:r>
       <w:r>
         <w:rPr>
@@ -4867,23 +4586,7 @@
           <w:sz w:val="28"/>
           <w:szCs w:val="28"/>
         </w:rPr>
-        <w:t xml:space="preserve"> = 1k</w:t>
-      </w:r>
-      <w:r>
-        <w:rPr>
-          <w:rFonts w:ascii="Times New Roman" w:hAnsi="Times New Roman" w:cs="Times New Roman"/>
-          <w:sz w:val="28"/>
-          <w:szCs w:val="28"/>
-        </w:rPr>
-        <w:t>Ω</w:t>
-      </w:r>
-      <w:r>
-        <w:rPr>
-          <w:rFonts w:ascii="Times New Roman" w:hAnsi="Times New Roman" w:cs="Times New Roman"/>
-          <w:sz w:val="28"/>
-          <w:szCs w:val="28"/>
-        </w:rPr>
-        <w:t xml:space="preserve">. </w:t>
+        <w:t xml:space="preserve"> = 1kΩ. </w:t>
       </w:r>
     </w:p>
     <w:p>
@@ -5133,15 +4836,7 @@
               <w:sz w:val="28"/>
               <w:szCs w:val="28"/>
             </w:rPr>
-            <m:t xml:space="preserve">=&gt; -2.5V= </m:t>
-          </m:r>
-          <m:r>
-            <w:rPr>
-              <w:rFonts w:ascii="Cambria Math" w:hAnsi="Cambria Math" w:cs="Times New Roman"/>
-              <w:sz w:val="28"/>
-              <w:szCs w:val="28"/>
-            </w:rPr>
-            <m:t>-5V</m:t>
+            <m:t>=&gt; -2.5V= -5V</m:t>
           </m:r>
           <m:d>
             <m:dPr>
@@ -5482,15 +5177,7 @@
               <w:sz w:val="28"/>
               <w:szCs w:val="28"/>
             </w:rPr>
-            <m:t>=</m:t>
-          </m:r>
-          <m:r>
-            <w:rPr>
-              <w:rFonts w:ascii="Cambria Math" w:hAnsi="Cambria Math" w:cs="Times New Roman"/>
-              <w:sz w:val="28"/>
-              <w:szCs w:val="28"/>
-            </w:rPr>
-            <m:t>-</m:t>
+            <m:t>=-</m:t>
           </m:r>
           <m:sSub>
             <m:sSubPr>
@@ -5610,15 +5297,7 @@
                           <w:sz w:val="28"/>
                           <w:szCs w:val="28"/>
                         </w:rPr>
-                        <m:t>IN</m:t>
-                      </m:r>
-                      <m:r>
-                        <w:rPr>
-                          <w:rFonts w:ascii="Cambria Math" w:hAnsi="Cambria Math" w:cs="Times New Roman"/>
-                          <w:sz w:val="28"/>
-                          <w:szCs w:val="28"/>
-                        </w:rPr>
-                        <m:t>1</m:t>
+                        <m:t>IN1</m:t>
                       </m:r>
                     </m:sub>
                   </m:sSub>
@@ -5706,15 +5385,7 @@
                           <w:sz w:val="28"/>
                           <w:szCs w:val="28"/>
                         </w:rPr>
-                        <m:t>IN</m:t>
-                      </m:r>
-                      <m:r>
-                        <w:rPr>
-                          <w:rFonts w:ascii="Cambria Math" w:hAnsi="Cambria Math" w:cs="Times New Roman"/>
-                          <w:sz w:val="28"/>
-                          <w:szCs w:val="28"/>
-                        </w:rPr>
-                        <m:t>2</m:t>
+                        <m:t>IN2</m:t>
                       </m:r>
                     </m:sub>
                   </m:sSub>
@@ -6221,6 +5892,7 @@
       <w:r>
         <w:rPr>
           <w:rFonts w:ascii="Times New Roman" w:hAnsi="Times New Roman" w:cs="Times New Roman"/>
+          <w:noProof/>
           <w:sz w:val="28"/>
           <w:szCs w:val="28"/>
         </w:rPr>
@@ -6273,41 +5945,19 @@
       <w:r>
         <w:t xml:space="preserve">Screenshot </w:t>
       </w:r>
-      <w:r>
-        <w:fldChar w:fldCharType="begin"/>
-      </w:r>
-      <w:r>
-        <w:instrText xml:space="preserve"> SEQ Screenshot \* ARABIC </w:instrText>
-      </w:r>
-      <w:r>
-        <w:fldChar w:fldCharType="separate"/>
-      </w:r>
-      <w:r>
-        <w:rPr>
-          <w:noProof/>
-        </w:rPr>
-        <w:t>8</w:t>
-      </w:r>
-      <w:r>
-        <w:fldChar w:fldCharType="end"/>
-      </w:r>
+      <w:fldSimple w:instr=" SEQ Screenshot \* ARABIC ">
+        <w:r>
+          <w:rPr>
+            <w:noProof/>
+          </w:rPr>
+          <w:t>8</w:t>
+        </w:r>
+      </w:fldSimple>
       <w:r>
         <w:rPr>
           <w:rFonts w:cstheme="minorHAnsi"/>
         </w:rPr>
-        <w:t xml:space="preserve">: </w:t>
-      </w:r>
-      <w:r>
-        <w:rPr>
-          <w:rFonts w:cstheme="minorHAnsi"/>
-        </w:rPr>
-        <w:t>Figure 6.6 (b) using a transient analysis with a stop time of 1m (.tran 1m</w:t>
-      </w:r>
-      <w:r>
-        <w:rPr>
-          <w:rFonts w:cstheme="minorHAnsi"/>
-        </w:rPr>
-        <w:t>) with inputs and output plotted</w:t>
+        <w:t>: Figure 6.6 (b) using a transient analysis with a stop time of 1m (.tran 1m) with inputs and output plotted</w:t>
       </w:r>
     </w:p>
     <w:p>
@@ -6925,15 +6575,59 @@
           <w:sz w:val="28"/>
           <w:szCs w:val="28"/>
         </w:rPr>
-        <w:t>Plot the input and output voltages, save an image of the plot. 3. Construct the circuit from Section 6.5.3 Item</w:t>
-      </w:r>
-      <w:r>
-        <w:rPr>
-          <w:rFonts w:ascii="Times New Roman" w:hAnsi="Times New Roman" w:cs="Times New Roman"/>
-          <w:sz w:val="28"/>
-          <w:szCs w:val="28"/>
-        </w:rPr>
-        <w:t>.</w:t>
+        <w:t>Plot the input and output voltages, save an image of the plot.</w:t>
+      </w:r>
+    </w:p>
+    <w:p>
+      <w:pPr>
+        <w:spacing w:before="120" w:line="240" w:lineRule="auto"/>
+        <w:rPr>
+          <w:rFonts w:ascii="Times New Roman" w:hAnsi="Times New Roman" w:cs="Times New Roman"/>
+          <w:sz w:val="28"/>
+          <w:szCs w:val="28"/>
+        </w:rPr>
+      </w:pPr>
+      <w:r>
+        <w:rPr>
+          <w:rFonts w:ascii="Times New Roman" w:hAnsi="Times New Roman" w:cs="Times New Roman"/>
+          <w:sz w:val="28"/>
+          <w:szCs w:val="28"/>
+        </w:rPr>
+        <w:drawing>
+          <wp:inline distT="0" distB="0" distL="0" distR="0" wp14:anchorId="6CCAF4AD" wp14:editId="6DA83886">
+            <wp:extent cx="6949440" cy="3907790"/>
+            <wp:effectExtent l="0" t="0" r="3810" b="0"/>
+            <wp:docPr id="1413879648" name="Picture 1"/>
+            <wp:cNvGraphicFramePr>
+              <a:graphicFrameLocks xmlns:a="http://schemas.openxmlformats.org/drawingml/2006/main" noChangeAspect="1"/>
+            </wp:cNvGraphicFramePr>
+            <a:graphic xmlns:a="http://schemas.openxmlformats.org/drawingml/2006/main">
+              <a:graphicData uri="http://schemas.openxmlformats.org/drawingml/2006/picture">
+                <pic:pic xmlns:pic="http://schemas.openxmlformats.org/drawingml/2006/picture">
+                  <pic:nvPicPr>
+                    <pic:cNvPr id="1413879648" name=""/>
+                    <pic:cNvPicPr/>
+                  </pic:nvPicPr>
+                  <pic:blipFill>
+                    <a:blip r:embed="rId22"/>
+                    <a:stretch>
+                      <a:fillRect/>
+                    </a:stretch>
+                  </pic:blipFill>
+                  <pic:spPr>
+                    <a:xfrm>
+                      <a:off x="0" y="0"/>
+                      <a:ext cx="6949440" cy="3907790"/>
+                    </a:xfrm>
+                    <a:prstGeom prst="rect">
+                      <a:avLst/>
+                    </a:prstGeom>
+                  </pic:spPr>
+                </pic:pic>
+              </a:graphicData>
+            </a:graphic>
+          </wp:inline>
+        </w:drawing>
       </w:r>
     </w:p>
     <w:p>
@@ -6956,6 +6650,22 @@
           <w:sz w:val="28"/>
           <w:szCs w:val="28"/>
         </w:rPr>
+        <w:t>Construct the circuit from Section 6.5.3 Item</w:t>
+      </w:r>
+      <w:r>
+        <w:rPr>
+          <w:rFonts w:ascii="Times New Roman" w:hAnsi="Times New Roman" w:cs="Times New Roman"/>
+          <w:sz w:val="28"/>
+          <w:szCs w:val="28"/>
+        </w:rPr>
+        <w:t xml:space="preserve"> 3. </w:t>
+      </w:r>
+      <w:r>
+        <w:rPr>
+          <w:rFonts w:ascii="Times New Roman" w:hAnsi="Times New Roman" w:cs="Times New Roman"/>
+          <w:sz w:val="28"/>
+          <w:szCs w:val="28"/>
+        </w:rPr>
         <w:t>Set Wavegen 1 to V</w:t>
       </w:r>
       <w:r>
@@ -6990,7 +6700,16 @@
           <w:sz w:val="28"/>
           <w:szCs w:val="28"/>
         </w:rPr>
-        <w:t>. Synchronize Wavegen 1 and Wavegen 2 using the dropdown in the wavegen tab of waveforms. It is located two tabs to the right of "Run all" and is defaulted to "No synchronization".</w:t>
+        <w:t xml:space="preserve">. Synchronize Wavegen 1 and Wavegen 2 using the dropdown in the wavegen tab of </w:t>
+      </w:r>
+      <w:r>
+        <w:rPr>
+          <w:rFonts w:ascii="Times New Roman" w:hAnsi="Times New Roman" w:cs="Times New Roman"/>
+          <w:sz w:val="28"/>
+          <w:szCs w:val="28"/>
+        </w:rPr>
+        <w:lastRenderedPageBreak/>
+        <w:t>waveforms. It is located two tabs to the right of "Run all" and is defaulted to "No synchronization".</w:t>
       </w:r>
     </w:p>
     <w:p>
@@ -7018,6 +6737,59 @@
     </w:p>
     <w:p>
       <w:pPr>
+        <w:spacing w:before="120" w:line="240" w:lineRule="auto"/>
+        <w:ind w:left="432"/>
+        <w:rPr>
+          <w:rFonts w:ascii="Times New Roman" w:hAnsi="Times New Roman" w:cs="Times New Roman"/>
+          <w:sz w:val="28"/>
+          <w:szCs w:val="28"/>
+        </w:rPr>
+      </w:pPr>
+      <w:r>
+        <w:rPr>
+          <w:rFonts w:ascii="Times New Roman" w:hAnsi="Times New Roman" w:cs="Times New Roman"/>
+          <w:sz w:val="28"/>
+          <w:szCs w:val="28"/>
+        </w:rPr>
+        <w:drawing>
+          <wp:inline distT="0" distB="0" distL="0" distR="0" wp14:anchorId="779D9FEC" wp14:editId="28C5171A">
+            <wp:extent cx="6949440" cy="3907790"/>
+            <wp:effectExtent l="0" t="0" r="3810" b="0"/>
+            <wp:docPr id="707690995" name="Picture 1"/>
+            <wp:cNvGraphicFramePr>
+              <a:graphicFrameLocks xmlns:a="http://schemas.openxmlformats.org/drawingml/2006/main" noChangeAspect="1"/>
+            </wp:cNvGraphicFramePr>
+            <a:graphic xmlns:a="http://schemas.openxmlformats.org/drawingml/2006/main">
+              <a:graphicData uri="http://schemas.openxmlformats.org/drawingml/2006/picture">
+                <pic:pic xmlns:pic="http://schemas.openxmlformats.org/drawingml/2006/picture">
+                  <pic:nvPicPr>
+                    <pic:cNvPr id="707690995" name=""/>
+                    <pic:cNvPicPr/>
+                  </pic:nvPicPr>
+                  <pic:blipFill>
+                    <a:blip r:embed="rId23"/>
+                    <a:stretch>
+                      <a:fillRect/>
+                    </a:stretch>
+                  </pic:blipFill>
+                  <pic:spPr>
+                    <a:xfrm>
+                      <a:off x="0" y="0"/>
+                      <a:ext cx="6949440" cy="3907790"/>
+                    </a:xfrm>
+                    <a:prstGeom prst="rect">
+                      <a:avLst/>
+                    </a:prstGeom>
+                  </pic:spPr>
+                </pic:pic>
+              </a:graphicData>
+            </a:graphic>
+          </wp:inline>
+        </w:drawing>
+      </w:r>
+    </w:p>
+    <w:p>
+      <w:pPr>
         <w:pStyle w:val="Heading3"/>
         <w:numPr>
           <w:ilvl w:val="1"/>
@@ -7237,7 +7009,6 @@
           <w:b/>
           <w:sz w:val="32"/>
         </w:rPr>
-        <w:lastRenderedPageBreak/>
         <w:t>CONCLUSION</w:t>
       </w:r>
     </w:p>
@@ -7258,16 +7029,17 @@
           <w:sz w:val="24"/>
           <w:szCs w:val="24"/>
         </w:rPr>
+        <w:lastRenderedPageBreak/>
         <w:t>fdsfsd</w:t>
       </w:r>
     </w:p>
     <w:sectPr>
-      <w:headerReference w:type="even" r:id="rId22"/>
-      <w:headerReference w:type="default" r:id="rId23"/>
-      <w:footerReference w:type="even" r:id="rId24"/>
-      <w:footerReference w:type="default" r:id="rId25"/>
-      <w:headerReference w:type="first" r:id="rId26"/>
-      <w:footerReference w:type="first" r:id="rId27"/>
+      <w:headerReference w:type="even" r:id="rId24"/>
+      <w:headerReference w:type="default" r:id="rId25"/>
+      <w:footerReference w:type="even" r:id="rId26"/>
+      <w:footerReference w:type="default" r:id="rId27"/>
+      <w:headerReference w:type="first" r:id="rId28"/>
+      <w:footerReference w:type="first" r:id="rId29"/>
       <w:pgSz w:w="12240" w:h="15840"/>
       <w:pgMar w:top="576" w:right="648" w:bottom="806" w:left="648" w:header="288" w:footer="144" w:gutter="0"/>
       <w:cols w:space="720"/>

</xml_diff>

<commit_message>
Added Lab 6 Write Up
</commit_message>
<xml_diff>
--- a/Lab-6_Operational-Amplifiers-Applications/Lab-6_Operational-Amplifiers-Applications.docx
+++ b/Lab-6_Operational-Amplifiers-Applications/Lab-6_Operational-Amplifiers-Applications.docx
@@ -218,8 +218,18 @@
           <w:sz w:val="28"/>
           <w:szCs w:val="28"/>
         </w:rPr>
-        <w:t>Laptop with LTSpice</w:t>
-      </w:r>
+        <w:t xml:space="preserve">Laptop with </w:t>
+      </w:r>
+      <w:proofErr w:type="spellStart"/>
+      <w:r>
+        <w:rPr>
+          <w:rFonts w:ascii="Times New Roman" w:hAnsi="Times New Roman" w:cs="Times New Roman"/>
+          <w:sz w:val="28"/>
+          <w:szCs w:val="28"/>
+        </w:rPr>
+        <w:t>LTSpice</w:t>
+      </w:r>
+      <w:proofErr w:type="spellEnd"/>
     </w:p>
     <w:p>
       <w:pPr>
@@ -2169,7 +2179,25 @@
           <w:szCs w:val="28"/>
         </w:rPr>
         <w:lastRenderedPageBreak/>
-        <w:t xml:space="preserve"> Simulate all three circuits in Figure 6.3 using a DC operating point (.op). Keep all the circuits on the same schematic and table the voltages V</w:t>
+        <w:t xml:space="preserve"> Simulate all three circuits in Figure 6.3 using a DC operating point </w:t>
+      </w:r>
+      <w:proofErr w:type="gramStart"/>
+      <w:r>
+        <w:rPr>
+          <w:rFonts w:ascii="Times New Roman" w:hAnsi="Times New Roman" w:cs="Times New Roman"/>
+          <w:sz w:val="28"/>
+          <w:szCs w:val="28"/>
+        </w:rPr>
+        <w:t>(.op</w:t>
+      </w:r>
+      <w:proofErr w:type="gramEnd"/>
+      <w:r>
+        <w:rPr>
+          <w:rFonts w:ascii="Times New Roman" w:hAnsi="Times New Roman" w:cs="Times New Roman"/>
+          <w:sz w:val="28"/>
+          <w:szCs w:val="28"/>
+        </w:rPr>
+        <w:t>). Keep all the circuits on the same schematic and table the voltages V</w:t>
       </w:r>
       <w:r>
         <w:rPr>
@@ -2305,7 +2333,21 @@
         <w:rPr>
           <w:rFonts w:cstheme="minorHAnsi"/>
         </w:rPr>
-        <w:t>ll three circuits in Figure 6.3 using a DC operating point (.op)</w:t>
+        <w:t xml:space="preserve">ll three circuits in Figure 6.3 using a DC operating point </w:t>
+      </w:r>
+      <w:proofErr w:type="gramStart"/>
+      <w:r>
+        <w:rPr>
+          <w:rFonts w:cstheme="minorHAnsi"/>
+        </w:rPr>
+        <w:t>(.op</w:t>
+      </w:r>
+      <w:proofErr w:type="gramEnd"/>
+      <w:r>
+        <w:rPr>
+          <w:rFonts w:cstheme="minorHAnsi"/>
+        </w:rPr>
+        <w:t>)</w:t>
       </w:r>
       <w:r>
         <w:rPr>
@@ -2588,7 +2630,15 @@
         </w:r>
       </w:fldSimple>
       <w:r>
-        <w:t>: Tabled Values of Figure 6.3 LTspice circuits</w:t>
+        <w:t xml:space="preserve">: Tabled Values of Figure 6.3 </w:t>
+      </w:r>
+      <w:proofErr w:type="spellStart"/>
+      <w:r>
+        <w:t>LTspice</w:t>
+      </w:r>
+      <w:proofErr w:type="spellEnd"/>
+      <w:r>
+        <w:t xml:space="preserve"> circuits</w:t>
       </w:r>
     </w:p>
     <w:p>
@@ -2875,7 +2925,35 @@
           <w:sz w:val="28"/>
           <w:szCs w:val="28"/>
         </w:rPr>
-        <w:t xml:space="preserve"> Simulate the circuit in Figure 6.4 (a) using a transient analysis with a stop time of 1m (.tran 1m). Set V</w:t>
+        <w:t xml:space="preserve"> Simulate the circuit in Figure 6.4 (a) using a transient analysis with a stop time of 1m </w:t>
+      </w:r>
+      <w:proofErr w:type="gramStart"/>
+      <w:r>
+        <w:rPr>
+          <w:rFonts w:ascii="Times New Roman" w:hAnsi="Times New Roman" w:cs="Times New Roman"/>
+          <w:sz w:val="28"/>
+          <w:szCs w:val="28"/>
+        </w:rPr>
+        <w:t>(.</w:t>
+      </w:r>
+      <w:proofErr w:type="spellStart"/>
+      <w:r>
+        <w:rPr>
+          <w:rFonts w:ascii="Times New Roman" w:hAnsi="Times New Roman" w:cs="Times New Roman"/>
+          <w:sz w:val="28"/>
+          <w:szCs w:val="28"/>
+        </w:rPr>
+        <w:t>tran</w:t>
+      </w:r>
+      <w:proofErr w:type="spellEnd"/>
+      <w:proofErr w:type="gramEnd"/>
+      <w:r>
+        <w:rPr>
+          <w:rFonts w:ascii="Times New Roman" w:hAnsi="Times New Roman" w:cs="Times New Roman"/>
+          <w:sz w:val="28"/>
+          <w:szCs w:val="28"/>
+        </w:rPr>
+        <w:t xml:space="preserve"> 1m). Set V</w:t>
       </w:r>
       <w:r>
         <w:rPr>
@@ -2971,7 +3049,29 @@
         <w:rPr>
           <w:rFonts w:cstheme="minorHAnsi"/>
         </w:rPr>
-        <w:t xml:space="preserve"> Figure 6.4 (a) using a transient analysis with a stop time of 1m (.tran 1m)</w:t>
+        <w:t xml:space="preserve"> Figure 6.4 (a) using a transient analysis with a stop time of 1m </w:t>
+      </w:r>
+      <w:proofErr w:type="gramStart"/>
+      <w:r>
+        <w:rPr>
+          <w:rFonts w:cstheme="minorHAnsi"/>
+        </w:rPr>
+        <w:t>(.</w:t>
+      </w:r>
+      <w:proofErr w:type="spellStart"/>
+      <w:r>
+        <w:rPr>
+          <w:rFonts w:cstheme="minorHAnsi"/>
+        </w:rPr>
+        <w:t>tran</w:t>
+      </w:r>
+      <w:proofErr w:type="spellEnd"/>
+      <w:proofErr w:type="gramEnd"/>
+      <w:r>
+        <w:rPr>
+          <w:rFonts w:cstheme="minorHAnsi"/>
+        </w:rPr>
+        <w:t xml:space="preserve"> 1m)</w:t>
       </w:r>
       <w:r>
         <w:rPr>
@@ -3076,7 +3176,35 @@
           <w:sz w:val="28"/>
           <w:szCs w:val="28"/>
         </w:rPr>
-        <w:t>. Simulate the circuit in Figure 6.4 (b) using a transient analysis with a stop time of 1m (.tran 1m). Set V</w:t>
+        <w:t xml:space="preserve">. Simulate the circuit in Figure 6.4 (b) using a transient analysis with a stop time of 1m </w:t>
+      </w:r>
+      <w:proofErr w:type="gramStart"/>
+      <w:r>
+        <w:rPr>
+          <w:rFonts w:ascii="Times New Roman" w:hAnsi="Times New Roman" w:cs="Times New Roman"/>
+          <w:sz w:val="28"/>
+          <w:szCs w:val="28"/>
+        </w:rPr>
+        <w:t>(.</w:t>
+      </w:r>
+      <w:proofErr w:type="spellStart"/>
+      <w:r>
+        <w:rPr>
+          <w:rFonts w:ascii="Times New Roman" w:hAnsi="Times New Roman" w:cs="Times New Roman"/>
+          <w:sz w:val="28"/>
+          <w:szCs w:val="28"/>
+        </w:rPr>
+        <w:t>tran</w:t>
+      </w:r>
+      <w:proofErr w:type="spellEnd"/>
+      <w:proofErr w:type="gramEnd"/>
+      <w:r>
+        <w:rPr>
+          <w:rFonts w:ascii="Times New Roman" w:hAnsi="Times New Roman" w:cs="Times New Roman"/>
+          <w:sz w:val="28"/>
+          <w:szCs w:val="28"/>
+        </w:rPr>
+        <w:t xml:space="preserve"> 1m). Set V</w:t>
       </w:r>
       <w:r>
         <w:rPr>
@@ -3174,7 +3302,29 @@
         <w:rPr>
           <w:rFonts w:cstheme="minorHAnsi"/>
         </w:rPr>
-        <w:t>Figure 6.4 (b) using a transient analysis with a stop time of 1m (.tran 1m). Set V</w:t>
+        <w:t xml:space="preserve">Figure 6.4 (b) using a transient analysis with a stop time of 1m </w:t>
+      </w:r>
+      <w:proofErr w:type="gramStart"/>
+      <w:r>
+        <w:rPr>
+          <w:rFonts w:cstheme="minorHAnsi"/>
+        </w:rPr>
+        <w:t>(.</w:t>
+      </w:r>
+      <w:proofErr w:type="spellStart"/>
+      <w:r>
+        <w:rPr>
+          <w:rFonts w:cstheme="minorHAnsi"/>
+        </w:rPr>
+        <w:t>tran</w:t>
+      </w:r>
+      <w:proofErr w:type="spellEnd"/>
+      <w:proofErr w:type="gramEnd"/>
+      <w:r>
+        <w:rPr>
+          <w:rFonts w:cstheme="minorHAnsi"/>
+        </w:rPr>
+        <w:t xml:space="preserve"> 1m). Set V</w:t>
       </w:r>
       <w:r>
         <w:rPr>
@@ -3210,7 +3360,25 @@
           <w:sz w:val="28"/>
           <w:szCs w:val="28"/>
         </w:rPr>
-        <w:t>Construct the circuit in Figure 6.4 (b) on a breadboard. Configure the Wavegen to generate a sine wave at 1 kHz with a 2 V amplitude and a 0 V offset. Plot the input and output on the Scope and save the circuit to demo at the start of lab. If you see clipping at your output, change the three 1kΩ resistors in the summing op amp to 33kΩ.</w:t>
+        <w:t xml:space="preserve">Construct the circuit in Figure 6.4 (b) on a breadboard. Configure the </w:t>
+      </w:r>
+      <w:proofErr w:type="spellStart"/>
+      <w:r>
+        <w:rPr>
+          <w:rFonts w:ascii="Times New Roman" w:hAnsi="Times New Roman" w:cs="Times New Roman"/>
+          <w:sz w:val="28"/>
+          <w:szCs w:val="28"/>
+        </w:rPr>
+        <w:t>Wavegen</w:t>
+      </w:r>
+      <w:proofErr w:type="spellEnd"/>
+      <w:r>
+        <w:rPr>
+          <w:rFonts w:ascii="Times New Roman" w:hAnsi="Times New Roman" w:cs="Times New Roman"/>
+          <w:sz w:val="28"/>
+          <w:szCs w:val="28"/>
+        </w:rPr>
+        <w:t xml:space="preserve"> to generate a sine wave at 1 kHz with a 2 V amplitude and a 0 V offset. Plot the input and output on the Scope and save the circuit to demo at the start of lab. If you see clipping at your output, change the three 1kΩ resistors in the summing op amp to 33kΩ.</w:t>
       </w:r>
     </w:p>
     <w:p>
@@ -3292,13 +3460,35 @@
         <w:rPr>
           <w:rFonts w:cstheme="minorHAnsi"/>
         </w:rPr>
-        <w:t xml:space="preserve">Figure 6.4 (b) on a breadboard. Configure the Wavegen to generate a sine wave at 1 kHz with a 2 V amplitude and a 0 V offset. </w:t>
-      </w:r>
+        <w:t xml:space="preserve">Figure 6.4 (b) on a breadboard. Configure the </w:t>
+      </w:r>
+      <w:proofErr w:type="spellStart"/>
       <w:r>
         <w:rPr>
           <w:rFonts w:cstheme="minorHAnsi"/>
         </w:rPr>
-        <w:t>Wavegen Window</w:t>
+        <w:t>Wavegen</w:t>
+      </w:r>
+      <w:proofErr w:type="spellEnd"/>
+      <w:r>
+        <w:rPr>
+          <w:rFonts w:cstheme="minorHAnsi"/>
+        </w:rPr>
+        <w:t xml:space="preserve"> to generate a sine wave at 1 kHz with a 2 V amplitude and a 0 V offset. </w:t>
+      </w:r>
+      <w:proofErr w:type="spellStart"/>
+      <w:r>
+        <w:rPr>
+          <w:rFonts w:cstheme="minorHAnsi"/>
+        </w:rPr>
+        <w:t>Wavegen</w:t>
+      </w:r>
+      <w:proofErr w:type="spellEnd"/>
+      <w:r>
+        <w:rPr>
+          <w:rFonts w:cstheme="minorHAnsi"/>
+        </w:rPr>
+        <w:t xml:space="preserve"> Window</w:t>
       </w:r>
     </w:p>
     <w:p>
@@ -3372,7 +3562,21 @@
         <w:rPr>
           <w:rFonts w:cstheme="minorHAnsi"/>
         </w:rPr>
-        <w:t>: Figure 6.4 (b) on a breadboard. Configure the Wavegen to generate a sine wave at 1 kHz with a 2 V amplitude and a 0 V offset. CH1 is input CH2 is output</w:t>
+        <w:t xml:space="preserve">: Figure 6.4 (b) on a breadboard. Configure the </w:t>
+      </w:r>
+      <w:proofErr w:type="spellStart"/>
+      <w:r>
+        <w:rPr>
+          <w:rFonts w:cstheme="minorHAnsi"/>
+        </w:rPr>
+        <w:t>Wavegen</w:t>
+      </w:r>
+      <w:proofErr w:type="spellEnd"/>
+      <w:r>
+        <w:rPr>
+          <w:rFonts w:cstheme="minorHAnsi"/>
+        </w:rPr>
+        <w:t xml:space="preserve"> to generate a sine wave at 1 kHz with a 2 V amplitude and a 0 V offset. CH1 is input CH2 is output</w:t>
       </w:r>
     </w:p>
     <w:p>
@@ -3403,7 +3607,35 @@
           <w:sz w:val="28"/>
           <w:szCs w:val="28"/>
         </w:rPr>
-        <w:t>he more general case, the full range of input must be accounted for. Simulate the circuit in Figure 6.5 using a transient analysis with a stop time of 1m (.tran 1m). Set V</w:t>
+        <w:t xml:space="preserve">he more general case, the full range of input must be accounted for. Simulate the circuit in Figure 6.5 using a transient analysis with a stop time of 1m </w:t>
+      </w:r>
+      <w:proofErr w:type="gramStart"/>
+      <w:r>
+        <w:rPr>
+          <w:rFonts w:ascii="Times New Roman" w:hAnsi="Times New Roman" w:cs="Times New Roman"/>
+          <w:sz w:val="28"/>
+          <w:szCs w:val="28"/>
+        </w:rPr>
+        <w:t>(.</w:t>
+      </w:r>
+      <w:proofErr w:type="spellStart"/>
+      <w:r>
+        <w:rPr>
+          <w:rFonts w:ascii="Times New Roman" w:hAnsi="Times New Roman" w:cs="Times New Roman"/>
+          <w:sz w:val="28"/>
+          <w:szCs w:val="28"/>
+        </w:rPr>
+        <w:t>tran</w:t>
+      </w:r>
+      <w:proofErr w:type="spellEnd"/>
+      <w:proofErr w:type="gramEnd"/>
+      <w:r>
+        <w:rPr>
+          <w:rFonts w:ascii="Times New Roman" w:hAnsi="Times New Roman" w:cs="Times New Roman"/>
+          <w:sz w:val="28"/>
+          <w:szCs w:val="28"/>
+        </w:rPr>
+        <w:t xml:space="preserve"> 1m). Set V</w:t>
       </w:r>
       <w:r>
         <w:rPr>
@@ -3452,7 +3684,16 @@
           <w:sz w:val="28"/>
           <w:szCs w:val="28"/>
         </w:rPr>
-        <w:t>This circuit uses 3 op amps to convert a +/- 5 V sine wave into a +5/0 V sine wave. The top op amp generates a -2.5 V offset, while the bottom op amp buffers half of the input voltage. Both outputs are then fed into an (inverting) summing op amp to produce V</w:t>
+        <w:t xml:space="preserve">This circuit uses 3 op amps to convert a +/- 5 V sine wave into a +5/0 V sine wave. The top op amp generates a -2.5 V offset, while the bottom op amp buffers half of the input voltage. Both outputs are then fed into an (inverting) summing op amp to produce </w:t>
+      </w:r>
+      <w:proofErr w:type="spellStart"/>
+      <w:r>
+        <w:rPr>
+          <w:rFonts w:ascii="Times New Roman" w:hAnsi="Times New Roman" w:cs="Times New Roman"/>
+          <w:sz w:val="28"/>
+          <w:szCs w:val="28"/>
+        </w:rPr>
+        <w:t>V</w:t>
       </w:r>
       <w:r>
         <w:rPr>
@@ -3463,6 +3704,7 @@
         </w:rPr>
         <w:t>outB</w:t>
       </w:r>
+      <w:proofErr w:type="spellEnd"/>
       <w:r>
         <w:rPr>
           <w:rFonts w:ascii="Times New Roman" w:hAnsi="Times New Roman" w:cs="Times New Roman"/>
@@ -3840,7 +4082,29 @@
         <w:rPr>
           <w:rFonts w:cstheme="minorHAnsi"/>
         </w:rPr>
-        <w:t>Figure 6.5 using a transient analysis with a stop time of 1m (.tran 1m). Set V</w:t>
+        <w:t xml:space="preserve">Figure 6.5 using a transient analysis with a stop time of 1m </w:t>
+      </w:r>
+      <w:proofErr w:type="gramStart"/>
+      <w:r>
+        <w:rPr>
+          <w:rFonts w:cstheme="minorHAnsi"/>
+        </w:rPr>
+        <w:t>(.</w:t>
+      </w:r>
+      <w:proofErr w:type="spellStart"/>
+      <w:r>
+        <w:rPr>
+          <w:rFonts w:cstheme="minorHAnsi"/>
+        </w:rPr>
+        <w:t>tran</w:t>
+      </w:r>
+      <w:proofErr w:type="spellEnd"/>
+      <w:proofErr w:type="gramEnd"/>
+      <w:r>
+        <w:rPr>
+          <w:rFonts w:cstheme="minorHAnsi"/>
+        </w:rPr>
+        <w:t xml:space="preserve"> 1m). Set V</w:t>
       </w:r>
       <w:r>
         <w:rPr>
@@ -4015,7 +4279,35 @@
           <w:sz w:val="28"/>
           <w:szCs w:val="28"/>
         </w:rPr>
-        <w:t>Simulate the circuit in Figure 6.6 (a) using a transient analysis with a stop time of 1m (.tran 1m). Set V</w:t>
+        <w:t xml:space="preserve">Simulate the circuit in Figure 6.6 (a) using a transient analysis with a stop time of 1m </w:t>
+      </w:r>
+      <w:proofErr w:type="gramStart"/>
+      <w:r>
+        <w:rPr>
+          <w:rFonts w:ascii="Times New Roman" w:hAnsi="Times New Roman" w:cs="Times New Roman"/>
+          <w:sz w:val="28"/>
+          <w:szCs w:val="28"/>
+        </w:rPr>
+        <w:t>(.</w:t>
+      </w:r>
+      <w:proofErr w:type="spellStart"/>
+      <w:r>
+        <w:rPr>
+          <w:rFonts w:ascii="Times New Roman" w:hAnsi="Times New Roman" w:cs="Times New Roman"/>
+          <w:sz w:val="28"/>
+          <w:szCs w:val="28"/>
+        </w:rPr>
+        <w:t>tran</w:t>
+      </w:r>
+      <w:proofErr w:type="spellEnd"/>
+      <w:proofErr w:type="gramEnd"/>
+      <w:r>
+        <w:rPr>
+          <w:rFonts w:ascii="Times New Roman" w:hAnsi="Times New Roman" w:cs="Times New Roman"/>
+          <w:sz w:val="28"/>
+          <w:szCs w:val="28"/>
+        </w:rPr>
+        <w:t xml:space="preserve"> 1m). Set V</w:t>
       </w:r>
       <w:r>
         <w:rPr>
@@ -4083,7 +4375,16 @@
           <w:sz w:val="28"/>
           <w:szCs w:val="28"/>
         </w:rPr>
-        <w:t>, and V</w:t>
+        <w:t xml:space="preserve">, and </w:t>
+      </w:r>
+      <w:proofErr w:type="spellStart"/>
+      <w:r>
+        <w:rPr>
+          <w:rFonts w:ascii="Times New Roman" w:hAnsi="Times New Roman" w:cs="Times New Roman"/>
+          <w:sz w:val="28"/>
+          <w:szCs w:val="28"/>
+        </w:rPr>
+        <w:t>V</w:t>
       </w:r>
       <w:r>
         <w:rPr>
@@ -4094,6 +4395,7 @@
         </w:rPr>
         <w:t>outA</w:t>
       </w:r>
+      <w:proofErr w:type="spellEnd"/>
       <w:r>
         <w:rPr>
           <w:rFonts w:ascii="Times New Roman" w:hAnsi="Times New Roman" w:cs="Times New Roman"/>
@@ -4366,7 +4668,16 @@
           <w:sz w:val="28"/>
           <w:szCs w:val="28"/>
         </w:rPr>
-        <w:t xml:space="preserve"> so that the output, V</w:t>
+        <w:t xml:space="preserve"> so that the output, </w:t>
+      </w:r>
+      <w:proofErr w:type="spellStart"/>
+      <w:r>
+        <w:rPr>
+          <w:rFonts w:ascii="Times New Roman" w:hAnsi="Times New Roman" w:cs="Times New Roman"/>
+          <w:sz w:val="28"/>
+          <w:szCs w:val="28"/>
+        </w:rPr>
+        <w:t>V</w:t>
       </w:r>
       <w:r>
         <w:rPr>
@@ -4377,6 +4688,7 @@
         </w:rPr>
         <w:t>outB</w:t>
       </w:r>
+      <w:proofErr w:type="spellEnd"/>
       <w:r>
         <w:rPr>
           <w:rFonts w:ascii="Times New Roman" w:hAnsi="Times New Roman" w:cs="Times New Roman"/>
@@ -5795,7 +6107,35 @@
           <w:sz w:val="28"/>
           <w:szCs w:val="28"/>
         </w:rPr>
-        <w:t>Simulate the circuit in Figure 6.6 (b) using a transient analysis with a stop time of 1m (.tran 1m). Set V</w:t>
+        <w:t xml:space="preserve">Simulate the circuit in Figure 6.6 (b) using a transient analysis with a stop time of 1m </w:t>
+      </w:r>
+      <w:proofErr w:type="gramStart"/>
+      <w:r>
+        <w:rPr>
+          <w:rFonts w:ascii="Times New Roman" w:hAnsi="Times New Roman" w:cs="Times New Roman"/>
+          <w:sz w:val="28"/>
+          <w:szCs w:val="28"/>
+        </w:rPr>
+        <w:t>(.</w:t>
+      </w:r>
+      <w:proofErr w:type="spellStart"/>
+      <w:r>
+        <w:rPr>
+          <w:rFonts w:ascii="Times New Roman" w:hAnsi="Times New Roman" w:cs="Times New Roman"/>
+          <w:sz w:val="28"/>
+          <w:szCs w:val="28"/>
+        </w:rPr>
+        <w:t>tran</w:t>
+      </w:r>
+      <w:proofErr w:type="spellEnd"/>
+      <w:proofErr w:type="gramEnd"/>
+      <w:r>
+        <w:rPr>
+          <w:rFonts w:ascii="Times New Roman" w:hAnsi="Times New Roman" w:cs="Times New Roman"/>
+          <w:sz w:val="28"/>
+          <w:szCs w:val="28"/>
+        </w:rPr>
+        <w:t xml:space="preserve"> 1m). Set V</w:t>
       </w:r>
       <w:r>
         <w:rPr>
@@ -5863,7 +6203,16 @@
           <w:sz w:val="28"/>
           <w:szCs w:val="28"/>
         </w:rPr>
-        <w:t>, and V</w:t>
+        <w:t xml:space="preserve">, and </w:t>
+      </w:r>
+      <w:proofErr w:type="spellStart"/>
+      <w:r>
+        <w:rPr>
+          <w:rFonts w:ascii="Times New Roman" w:hAnsi="Times New Roman" w:cs="Times New Roman"/>
+          <w:sz w:val="28"/>
+          <w:szCs w:val="28"/>
+        </w:rPr>
+        <w:t>V</w:t>
       </w:r>
       <w:r>
         <w:rPr>
@@ -5874,6 +6223,7 @@
         </w:rPr>
         <w:t>outB</w:t>
       </w:r>
+      <w:proofErr w:type="spellEnd"/>
       <w:r>
         <w:rPr>
           <w:rFonts w:ascii="Times New Roman" w:hAnsi="Times New Roman" w:cs="Times New Roman"/>
@@ -5957,7 +6307,29 @@
         <w:rPr>
           <w:rFonts w:cstheme="minorHAnsi"/>
         </w:rPr>
-        <w:t>: Figure 6.6 (b) using a transient analysis with a stop time of 1m (.tran 1m) with inputs and output plotted</w:t>
+        <w:t xml:space="preserve">: Figure 6.6 (b) using a transient analysis with a stop time of 1m </w:t>
+      </w:r>
+      <w:proofErr w:type="gramStart"/>
+      <w:r>
+        <w:rPr>
+          <w:rFonts w:cstheme="minorHAnsi"/>
+        </w:rPr>
+        <w:t>(.</w:t>
+      </w:r>
+      <w:proofErr w:type="spellStart"/>
+      <w:r>
+        <w:rPr>
+          <w:rFonts w:cstheme="minorHAnsi"/>
+        </w:rPr>
+        <w:t>tran</w:t>
+      </w:r>
+      <w:proofErr w:type="spellEnd"/>
+      <w:proofErr w:type="gramEnd"/>
+      <w:r>
+        <w:rPr>
+          <w:rFonts w:cstheme="minorHAnsi"/>
+        </w:rPr>
+        <w:t xml:space="preserve"> 1m) with inputs and output plotted</w:t>
       </w:r>
     </w:p>
     <w:p>
@@ -6535,7 +6907,25 @@
           <w:sz w:val="28"/>
           <w:szCs w:val="28"/>
         </w:rPr>
-        <w:t>Construct the circuit from Section 6.5.2 Item 5. Set Wavegen 1, V</w:t>
+        <w:t xml:space="preserve">Construct the circuit from Section 6.5.2 Item 5. Set </w:t>
+      </w:r>
+      <w:proofErr w:type="spellStart"/>
+      <w:r>
+        <w:rPr>
+          <w:rFonts w:ascii="Times New Roman" w:hAnsi="Times New Roman" w:cs="Times New Roman"/>
+          <w:sz w:val="28"/>
+          <w:szCs w:val="28"/>
+        </w:rPr>
+        <w:t>Wavegen</w:t>
+      </w:r>
+      <w:proofErr w:type="spellEnd"/>
+      <w:r>
+        <w:rPr>
+          <w:rFonts w:ascii="Times New Roman" w:hAnsi="Times New Roman" w:cs="Times New Roman"/>
+          <w:sz w:val="28"/>
+          <w:szCs w:val="28"/>
+        </w:rPr>
+        <w:t xml:space="preserve"> 1, V</w:t>
       </w:r>
       <w:r>
         <w:rPr>
@@ -6580,16 +6970,14 @@
     </w:p>
     <w:p>
       <w:pPr>
+        <w:keepNext/>
         <w:spacing w:before="120" w:line="240" w:lineRule="auto"/>
-        <w:rPr>
-          <w:rFonts w:ascii="Times New Roman" w:hAnsi="Times New Roman" w:cs="Times New Roman"/>
-          <w:sz w:val="28"/>
-          <w:szCs w:val="28"/>
-        </w:rPr>
-      </w:pPr>
-      <w:r>
-        <w:rPr>
-          <w:rFonts w:ascii="Times New Roman" w:hAnsi="Times New Roman" w:cs="Times New Roman"/>
+        <w:jc w:val="center"/>
+      </w:pPr>
+      <w:r>
+        <w:rPr>
+          <w:rFonts w:ascii="Times New Roman" w:hAnsi="Times New Roman" w:cs="Times New Roman"/>
+          <w:noProof/>
           <w:sz w:val="28"/>
           <w:szCs w:val="28"/>
         </w:rPr>
@@ -6632,6 +7020,43 @@
     </w:p>
     <w:p>
       <w:pPr>
+        <w:pStyle w:val="Caption"/>
+        <w:jc w:val="center"/>
+      </w:pPr>
+      <w:r>
+        <w:t xml:space="preserve">Screenshot </w:t>
+      </w:r>
+      <w:fldSimple w:instr=" SEQ Screenshot \* ARABIC ">
+        <w:r>
+          <w:rPr>
+            <w:noProof/>
+          </w:rPr>
+          <w:t>9</w:t>
+        </w:r>
+      </w:fldSimple>
+      <w:r>
+        <w:t xml:space="preserve">: </w:t>
+      </w:r>
+      <w:r>
+        <w:t>C</w:t>
+      </w:r>
+      <w:r>
+        <w:t xml:space="preserve">ircuit from Section 6.5.2 Item 5. Set </w:t>
+      </w:r>
+      <w:proofErr w:type="spellStart"/>
+      <w:r>
+        <w:t>Wavegen</w:t>
+      </w:r>
+      <w:proofErr w:type="spellEnd"/>
+      <w:r>
+        <w:t xml:space="preserve"> 1, VIN to a sine wave with a 5 V amplitude, 0 V offset, and a frequency of 1 kHz.</w:t>
+      </w:r>
+      <w:r>
+        <w:t xml:space="preserve"> CH1 is input, CH2 is output</w:t>
+      </w:r>
+    </w:p>
+    <w:p>
+      <w:pPr>
         <w:pStyle w:val="ListParagraph"/>
         <w:numPr>
           <w:ilvl w:val="0"/>
@@ -6650,6 +7075,7 @@
           <w:sz w:val="28"/>
           <w:szCs w:val="28"/>
         </w:rPr>
+        <w:lastRenderedPageBreak/>
         <w:t>Construct the circuit from Section 6.5.3 Item</w:t>
       </w:r>
       <w:r>
@@ -6666,7 +7092,25 @@
           <w:sz w:val="28"/>
           <w:szCs w:val="28"/>
         </w:rPr>
-        <w:t>Set Wavegen 1 to V</w:t>
+        <w:t xml:space="preserve">Set </w:t>
+      </w:r>
+      <w:proofErr w:type="spellStart"/>
+      <w:r>
+        <w:rPr>
+          <w:rFonts w:ascii="Times New Roman" w:hAnsi="Times New Roman" w:cs="Times New Roman"/>
+          <w:sz w:val="28"/>
+          <w:szCs w:val="28"/>
+        </w:rPr>
+        <w:t>Wavegen</w:t>
+      </w:r>
+      <w:proofErr w:type="spellEnd"/>
+      <w:r>
+        <w:rPr>
+          <w:rFonts w:ascii="Times New Roman" w:hAnsi="Times New Roman" w:cs="Times New Roman"/>
+          <w:sz w:val="28"/>
+          <w:szCs w:val="28"/>
+        </w:rPr>
+        <w:t xml:space="preserve"> 1 to V</w:t>
       </w:r>
       <w:r>
         <w:rPr>
@@ -6683,7 +7127,25 @@
           <w:sz w:val="28"/>
           <w:szCs w:val="28"/>
         </w:rPr>
-        <w:t xml:space="preserve"> and Wavegen 2 to V</w:t>
+        <w:t xml:space="preserve"> and </w:t>
+      </w:r>
+      <w:proofErr w:type="spellStart"/>
+      <w:r>
+        <w:rPr>
+          <w:rFonts w:ascii="Times New Roman" w:hAnsi="Times New Roman" w:cs="Times New Roman"/>
+          <w:sz w:val="28"/>
+          <w:szCs w:val="28"/>
+        </w:rPr>
+        <w:t>Wavegen</w:t>
+      </w:r>
+      <w:proofErr w:type="spellEnd"/>
+      <w:r>
+        <w:rPr>
+          <w:rFonts w:ascii="Times New Roman" w:hAnsi="Times New Roman" w:cs="Times New Roman"/>
+          <w:sz w:val="28"/>
+          <w:szCs w:val="28"/>
+        </w:rPr>
+        <w:t xml:space="preserve"> 2 to V</w:t>
       </w:r>
       <w:r>
         <w:rPr>
@@ -6700,16 +7162,61 @@
           <w:sz w:val="28"/>
           <w:szCs w:val="28"/>
         </w:rPr>
-        <w:t xml:space="preserve">. Synchronize Wavegen 1 and Wavegen 2 using the dropdown in the wavegen tab of </w:t>
-      </w:r>
-      <w:r>
-        <w:rPr>
-          <w:rFonts w:ascii="Times New Roman" w:hAnsi="Times New Roman" w:cs="Times New Roman"/>
-          <w:sz w:val="28"/>
-          <w:szCs w:val="28"/>
-        </w:rPr>
-        <w:lastRenderedPageBreak/>
-        <w:t>waveforms. It is located two tabs to the right of "Run all" and is defaulted to "No synchronization".</w:t>
+        <w:t xml:space="preserve">. Synchronize </w:t>
+      </w:r>
+      <w:proofErr w:type="spellStart"/>
+      <w:r>
+        <w:rPr>
+          <w:rFonts w:ascii="Times New Roman" w:hAnsi="Times New Roman" w:cs="Times New Roman"/>
+          <w:sz w:val="28"/>
+          <w:szCs w:val="28"/>
+        </w:rPr>
+        <w:t>Wavegen</w:t>
+      </w:r>
+      <w:proofErr w:type="spellEnd"/>
+      <w:r>
+        <w:rPr>
+          <w:rFonts w:ascii="Times New Roman" w:hAnsi="Times New Roman" w:cs="Times New Roman"/>
+          <w:sz w:val="28"/>
+          <w:szCs w:val="28"/>
+        </w:rPr>
+        <w:t xml:space="preserve"> 1 and </w:t>
+      </w:r>
+      <w:proofErr w:type="spellStart"/>
+      <w:r>
+        <w:rPr>
+          <w:rFonts w:ascii="Times New Roman" w:hAnsi="Times New Roman" w:cs="Times New Roman"/>
+          <w:sz w:val="28"/>
+          <w:szCs w:val="28"/>
+        </w:rPr>
+        <w:t>Wavegen</w:t>
+      </w:r>
+      <w:proofErr w:type="spellEnd"/>
+      <w:r>
+        <w:rPr>
+          <w:rFonts w:ascii="Times New Roman" w:hAnsi="Times New Roman" w:cs="Times New Roman"/>
+          <w:sz w:val="28"/>
+          <w:szCs w:val="28"/>
+        </w:rPr>
+        <w:t xml:space="preserve"> 2 using the dropdown in the </w:t>
+      </w:r>
+      <w:proofErr w:type="spellStart"/>
+      <w:r>
+        <w:rPr>
+          <w:rFonts w:ascii="Times New Roman" w:hAnsi="Times New Roman" w:cs="Times New Roman"/>
+          <w:sz w:val="28"/>
+          <w:szCs w:val="28"/>
+        </w:rPr>
+        <w:t>wavegen</w:t>
+      </w:r>
+      <w:proofErr w:type="spellEnd"/>
+      <w:r>
+        <w:rPr>
+          <w:rFonts w:ascii="Times New Roman" w:hAnsi="Times New Roman" w:cs="Times New Roman"/>
+          <w:sz w:val="28"/>
+          <w:szCs w:val="28"/>
+        </w:rPr>
+        <w:t xml:space="preserve"> tab of waveforms. It is located two tabs to the right of "Run all" and is defaulted to "No synchronization".</w:t>
       </w:r>
     </w:p>
     <w:p>
@@ -6732,22 +7239,56 @@
           <w:sz w:val="28"/>
           <w:szCs w:val="28"/>
         </w:rPr>
-        <w:t xml:space="preserve">Plot the input (differential) and the output voltages, then save an image of the plot. Typically, scope wire 2 (with the white stripe) is connected to ground because scopes measure voltages relative to another signal. In this case, however, you connect scope wire 1 to Wavegen 1 and scope wire 2 to Wavegen 2, allowing the scope to measure the difference between them. </w:t>
-      </w:r>
-    </w:p>
-    <w:p>
-      <w:pPr>
+        <w:t xml:space="preserve">Plot the input (differential) and the output voltages, then save an image of the plot. Typically, scope wire 2 (with the white stripe) is connected to ground because scopes measure voltages relative to another signal. In this case, however, you connect scope wire 1 to </w:t>
+      </w:r>
+      <w:proofErr w:type="spellStart"/>
+      <w:r>
+        <w:rPr>
+          <w:rFonts w:ascii="Times New Roman" w:hAnsi="Times New Roman" w:cs="Times New Roman"/>
+          <w:sz w:val="28"/>
+          <w:szCs w:val="28"/>
+        </w:rPr>
+        <w:t>Wavegen</w:t>
+      </w:r>
+      <w:proofErr w:type="spellEnd"/>
+      <w:r>
+        <w:rPr>
+          <w:rFonts w:ascii="Times New Roman" w:hAnsi="Times New Roman" w:cs="Times New Roman"/>
+          <w:sz w:val="28"/>
+          <w:szCs w:val="28"/>
+        </w:rPr>
+        <w:t xml:space="preserve"> 1 and scope wire 2 to </w:t>
+      </w:r>
+      <w:proofErr w:type="spellStart"/>
+      <w:r>
+        <w:rPr>
+          <w:rFonts w:ascii="Times New Roman" w:hAnsi="Times New Roman" w:cs="Times New Roman"/>
+          <w:sz w:val="28"/>
+          <w:szCs w:val="28"/>
+        </w:rPr>
+        <w:t>Wavegen</w:t>
+      </w:r>
+      <w:proofErr w:type="spellEnd"/>
+      <w:r>
+        <w:rPr>
+          <w:rFonts w:ascii="Times New Roman" w:hAnsi="Times New Roman" w:cs="Times New Roman"/>
+          <w:sz w:val="28"/>
+          <w:szCs w:val="28"/>
+        </w:rPr>
+        <w:t xml:space="preserve"> 2, allowing the scope to measure the difference between them. </w:t>
+      </w:r>
+    </w:p>
+    <w:p>
+      <w:pPr>
+        <w:keepNext/>
         <w:spacing w:before="120" w:line="240" w:lineRule="auto"/>
         <w:ind w:left="432"/>
-        <w:rPr>
-          <w:rFonts w:ascii="Times New Roman" w:hAnsi="Times New Roman" w:cs="Times New Roman"/>
-          <w:sz w:val="28"/>
-          <w:szCs w:val="28"/>
-        </w:rPr>
-      </w:pPr>
-      <w:r>
-        <w:rPr>
-          <w:rFonts w:ascii="Times New Roman" w:hAnsi="Times New Roman" w:cs="Times New Roman"/>
+        <w:jc w:val="center"/>
+      </w:pPr>
+      <w:r>
+        <w:rPr>
+          <w:rFonts w:ascii="Times New Roman" w:hAnsi="Times New Roman" w:cs="Times New Roman"/>
+          <w:noProof/>
           <w:sz w:val="28"/>
           <w:szCs w:val="28"/>
         </w:rPr>
@@ -6790,6 +7331,77 @@
     </w:p>
     <w:p>
       <w:pPr>
+        <w:pStyle w:val="Caption"/>
+        <w:jc w:val="center"/>
+        <w:rPr>
+          <w:rFonts w:ascii="Times New Roman" w:hAnsi="Times New Roman" w:cs="Times New Roman"/>
+          <w:sz w:val="28"/>
+          <w:szCs w:val="28"/>
+        </w:rPr>
+      </w:pPr>
+      <w:r>
+        <w:t xml:space="preserve">Screenshot </w:t>
+      </w:r>
+      <w:fldSimple w:instr=" SEQ Screenshot \* ARABIC ">
+        <w:r>
+          <w:rPr>
+            <w:noProof/>
+          </w:rPr>
+          <w:t>10</w:t>
+        </w:r>
+      </w:fldSimple>
+      <w:r>
+        <w:t>: C</w:t>
+      </w:r>
+      <w:r>
+        <w:t xml:space="preserve">ircuit from Section 6.5.3 Item 3. Set </w:t>
+      </w:r>
+      <w:proofErr w:type="spellStart"/>
+      <w:r>
+        <w:t>Wavegen</w:t>
+      </w:r>
+      <w:proofErr w:type="spellEnd"/>
+      <w:r>
+        <w:t xml:space="preserve"> 1 to VIN1 and </w:t>
+      </w:r>
+      <w:proofErr w:type="spellStart"/>
+      <w:r>
+        <w:t>Wavegen</w:t>
+      </w:r>
+      <w:proofErr w:type="spellEnd"/>
+      <w:r>
+        <w:t xml:space="preserve"> 2 to VIN2. Synchronize </w:t>
+      </w:r>
+      <w:proofErr w:type="spellStart"/>
+      <w:r>
+        <w:t>Wavegen</w:t>
+      </w:r>
+      <w:proofErr w:type="spellEnd"/>
+      <w:r>
+        <w:t xml:space="preserve"> 1 and </w:t>
+      </w:r>
+      <w:proofErr w:type="spellStart"/>
+      <w:r>
+        <w:t>Wavegen</w:t>
+      </w:r>
+      <w:proofErr w:type="spellEnd"/>
+      <w:r>
+        <w:t xml:space="preserve"> 2 using the dropdown in the </w:t>
+      </w:r>
+      <w:proofErr w:type="spellStart"/>
+      <w:r>
+        <w:t>wavegen</w:t>
+      </w:r>
+      <w:proofErr w:type="spellEnd"/>
+      <w:r>
+        <w:t xml:space="preserve"> tab of waveforms.</w:t>
+      </w:r>
+      <w:r>
+        <w:t xml:space="preserve"> CH1 is input and CH2 is output.</w:t>
+      </w:r>
+    </w:p>
+    <w:p>
+      <w:pPr>
         <w:pStyle w:val="Heading3"/>
         <w:numPr>
           <w:ilvl w:val="1"/>
@@ -6879,7 +7491,25 @@
           <w:sz w:val="28"/>
           <w:szCs w:val="28"/>
         </w:rPr>
-        <w:t>Item 1: LTspice schematic of the circuit.</w:t>
+        <w:t xml:space="preserve">Item 1: </w:t>
+      </w:r>
+      <w:proofErr w:type="spellStart"/>
+      <w:r>
+        <w:rPr>
+          <w:rFonts w:ascii="Times New Roman" w:hAnsi="Times New Roman" w:cs="Times New Roman"/>
+          <w:sz w:val="28"/>
+          <w:szCs w:val="28"/>
+        </w:rPr>
+        <w:t>LTspice</w:t>
+      </w:r>
+      <w:proofErr w:type="spellEnd"/>
+      <w:r>
+        <w:rPr>
+          <w:rFonts w:ascii="Times New Roman" w:hAnsi="Times New Roman" w:cs="Times New Roman"/>
+          <w:sz w:val="28"/>
+          <w:szCs w:val="28"/>
+        </w:rPr>
+        <w:t xml:space="preserve"> schematic of the circuit.</w:t>
       </w:r>
     </w:p>
     <w:p>
@@ -6925,7 +7555,25 @@
           <w:sz w:val="28"/>
           <w:szCs w:val="28"/>
         </w:rPr>
-        <w:t>Item 3: LTspice schematic of the circuit with all calculated resistors.</w:t>
+        <w:t xml:space="preserve">Item 3: </w:t>
+      </w:r>
+      <w:proofErr w:type="spellStart"/>
+      <w:r>
+        <w:rPr>
+          <w:rFonts w:ascii="Times New Roman" w:hAnsi="Times New Roman" w:cs="Times New Roman"/>
+          <w:sz w:val="28"/>
+          <w:szCs w:val="28"/>
+        </w:rPr>
+        <w:t>LTspice</w:t>
+      </w:r>
+      <w:proofErr w:type="spellEnd"/>
+      <w:r>
+        <w:rPr>
+          <w:rFonts w:ascii="Times New Roman" w:hAnsi="Times New Roman" w:cs="Times New Roman"/>
+          <w:sz w:val="28"/>
+          <w:szCs w:val="28"/>
+        </w:rPr>
+        <w:t xml:space="preserve"> schematic of the circuit with all calculated resistors.</w:t>
       </w:r>
     </w:p>
     <w:p>
@@ -6956,6 +7604,111 @@
         <w:spacing w:line="259" w:lineRule="auto"/>
         <w:rPr>
           <w:rFonts w:ascii="Times New Roman" w:hAnsi="Times New Roman" w:cs="Times New Roman"/>
+          <w:sz w:val="28"/>
+          <w:szCs w:val="28"/>
+        </w:rPr>
+      </w:pPr>
+      <w:r>
+        <w:rPr>
+          <w:rFonts w:ascii="Times New Roman" w:hAnsi="Times New Roman" w:cs="Times New Roman"/>
+          <w:b/>
+          <w:bCs/>
+          <w:sz w:val="28"/>
+          <w:szCs w:val="28"/>
+        </w:rPr>
+        <w:t>D</w:t>
+      </w:r>
+      <w:r>
+        <w:rPr>
+          <w:rFonts w:ascii="Times New Roman" w:hAnsi="Times New Roman" w:cs="Times New Roman"/>
+          <w:b/>
+          <w:bCs/>
+          <w:sz w:val="28"/>
+          <w:szCs w:val="28"/>
+        </w:rPr>
+        <w:t xml:space="preserve">iscussion Question: </w:t>
+      </w:r>
+      <w:r>
+        <w:rPr>
+          <w:rFonts w:ascii="Times New Roman" w:hAnsi="Times New Roman" w:cs="Times New Roman"/>
+          <w:sz w:val="28"/>
+          <w:szCs w:val="28"/>
+        </w:rPr>
+        <w:t xml:space="preserve">Discuss the two circuits constructed in lab, DC level shifter and differential to single ended converter. Explain how each circuit works at the block level and how </w:t>
+      </w:r>
+      <w:r>
+        <w:rPr>
+          <w:rFonts w:ascii="Times New Roman" w:hAnsi="Times New Roman" w:cs="Times New Roman"/>
+          <w:sz w:val="28"/>
+          <w:szCs w:val="28"/>
+        </w:rPr>
+        <w:lastRenderedPageBreak/>
+        <w:t xml:space="preserve">resistor tolerance could or could not influence the output. Also explain the design choices for the circuit, Section 6.5.3 Item 3, constructed in lab. Which resistors were chosen and why? </w:t>
+      </w:r>
+    </w:p>
+    <w:p>
+      <w:pPr>
+        <w:spacing w:line="259" w:lineRule="auto"/>
+        <w:rPr>
+          <w:rFonts w:ascii="Times New Roman" w:hAnsi="Times New Roman" w:cs="Times New Roman"/>
+          <w:sz w:val="28"/>
+          <w:szCs w:val="28"/>
+        </w:rPr>
+      </w:pPr>
+      <w:r>
+        <w:rPr>
+          <w:rFonts w:ascii="Times New Roman" w:hAnsi="Times New Roman" w:cs="Times New Roman"/>
+          <w:sz w:val="28"/>
+          <w:szCs w:val="28"/>
+        </w:rPr>
+        <w:t xml:space="preserve">The </w:t>
+      </w:r>
+      <w:r>
+        <w:rPr>
+          <w:rFonts w:ascii="Times New Roman" w:hAnsi="Times New Roman" w:cs="Times New Roman"/>
+          <w:sz w:val="28"/>
+          <w:szCs w:val="28"/>
+        </w:rPr>
+        <w:t>circuit in Figure 6.6 (b) works in two stages. The first op-amp acts as a difference amplifier, measuring the voltage difference between the differential inputs to remove common-mode noise and outputting a single-ended bi-polar signal. The second and third op-amps form a DC level shifter, where one buffers the negative voltage reference and the other acts as an inverting summing amplifier</w:t>
+      </w:r>
+      <w:r>
+        <w:rPr>
+          <w:rFonts w:ascii="Times New Roman" w:hAnsi="Times New Roman" w:cs="Times New Roman"/>
+          <w:sz w:val="28"/>
+          <w:szCs w:val="28"/>
+        </w:rPr>
+        <w:t xml:space="preserve"> to shift the single-ended bi-polar signal to a strictly positive 0V-5V range suitable for digital processing. </w:t>
+      </w:r>
+      <w:r>
+        <w:rPr>
+          <w:rFonts w:ascii="Times New Roman" w:hAnsi="Times New Roman" w:cs="Times New Roman"/>
+          <w:sz w:val="28"/>
+          <w:szCs w:val="28"/>
+        </w:rPr>
+        <w:t xml:space="preserve">Resistor tolerances in these stages will impact the </w:t>
+      </w:r>
+      <w:r>
+        <w:rPr>
+          <w:rFonts w:ascii="Times New Roman" w:hAnsi="Times New Roman" w:cs="Times New Roman"/>
+          <w:sz w:val="28"/>
+          <w:szCs w:val="28"/>
+        </w:rPr>
+        <w:t>common-mode</w:t>
+      </w:r>
+      <w:r>
+        <w:rPr>
+          <w:rFonts w:ascii="Times New Roman" w:hAnsi="Times New Roman" w:cs="Times New Roman"/>
+          <w:sz w:val="28"/>
+          <w:szCs w:val="28"/>
+        </w:rPr>
+        <w:t xml:space="preserve"> rejection ratio and the accuracy of the DC offset, potentially leading to clipped signals or residual noise at the output.</w:t>
+      </w:r>
+    </w:p>
+    <w:p>
+      <w:pPr>
+        <w:spacing w:line="259" w:lineRule="auto"/>
+        <w:rPr>
+          <w:rFonts w:ascii="Times New Roman" w:hAnsi="Times New Roman" w:cs="Times New Roman"/>
           <w:b/>
           <w:bCs/>
           <w:sz w:val="24"/>
@@ -6964,30 +7717,436 @@
       <w:r>
         <w:rPr>
           <w:rFonts w:ascii="Times New Roman" w:hAnsi="Times New Roman" w:cs="Times New Roman"/>
-          <w:b/>
-          <w:bCs/>
-          <w:sz w:val="28"/>
-          <w:szCs w:val="28"/>
-        </w:rPr>
-        <w:t>D</w:t>
-      </w:r>
-      <w:r>
-        <w:rPr>
-          <w:rFonts w:ascii="Times New Roman" w:hAnsi="Times New Roman" w:cs="Times New Roman"/>
-          <w:b/>
-          <w:bCs/>
-          <w:sz w:val="28"/>
-          <w:szCs w:val="28"/>
-        </w:rPr>
-        <w:t xml:space="preserve">iscussion Question: </w:t>
-      </w:r>
-      <w:r>
-        <w:rPr>
-          <w:rFonts w:ascii="Times New Roman" w:hAnsi="Times New Roman" w:cs="Times New Roman"/>
-          <w:sz w:val="28"/>
-          <w:szCs w:val="28"/>
-        </w:rPr>
-        <w:t xml:space="preserve">Discuss the two circuits constructed in lab, DC level shifter and differential to single ended converter. Explain how each circuit works at the block level and how resistor tolerance could or could not influence the output. Also explain the design choices for the circuit, Section 6.5.3 Item 3, constructed in lab. Which resistors were chosen and why? </w:t>
+          <w:sz w:val="28"/>
+          <w:szCs w:val="28"/>
+        </w:rPr>
+        <w:t xml:space="preserve">For Section 6.5.3 Item 3, I used </w:t>
+      </w:r>
+      <w:r>
+        <w:rPr>
+          <w:rFonts w:ascii="Times New Roman" w:hAnsi="Times New Roman" w:cs="Times New Roman"/>
+          <w:sz w:val="28"/>
+          <w:szCs w:val="28"/>
+        </w:rPr>
+        <w:t>R</w:t>
+      </w:r>
+      <w:r>
+        <w:rPr>
+          <w:rFonts w:ascii="Times New Roman" w:hAnsi="Times New Roman" w:cs="Times New Roman"/>
+          <w:sz w:val="28"/>
+          <w:szCs w:val="28"/>
+          <w:vertAlign w:val="subscript"/>
+        </w:rPr>
+        <w:t>1</w:t>
+      </w:r>
+      <w:r>
+        <w:rPr>
+          <w:rFonts w:ascii="Times New Roman" w:hAnsi="Times New Roman" w:cs="Times New Roman"/>
+          <w:sz w:val="28"/>
+          <w:szCs w:val="28"/>
+        </w:rPr>
+        <w:t xml:space="preserve"> = 10kΩ, R</w:t>
+      </w:r>
+      <w:r>
+        <w:rPr>
+          <w:rFonts w:ascii="Times New Roman" w:hAnsi="Times New Roman" w:cs="Times New Roman"/>
+          <w:sz w:val="28"/>
+          <w:szCs w:val="28"/>
+          <w:vertAlign w:val="subscript"/>
+        </w:rPr>
+        <w:t>2</w:t>
+      </w:r>
+      <w:r>
+        <w:rPr>
+          <w:rFonts w:ascii="Times New Roman" w:hAnsi="Times New Roman" w:cs="Times New Roman"/>
+          <w:sz w:val="28"/>
+          <w:szCs w:val="28"/>
+        </w:rPr>
+        <w:t xml:space="preserve"> = 10kΩ, R</w:t>
+      </w:r>
+      <w:r>
+        <w:rPr>
+          <w:rFonts w:ascii="Times New Roman" w:hAnsi="Times New Roman" w:cs="Times New Roman"/>
+          <w:sz w:val="28"/>
+          <w:szCs w:val="28"/>
+          <w:vertAlign w:val="subscript"/>
+        </w:rPr>
+        <w:t>3</w:t>
+      </w:r>
+      <w:r>
+        <w:rPr>
+          <w:rFonts w:ascii="Times New Roman" w:hAnsi="Times New Roman" w:cs="Times New Roman"/>
+          <w:sz w:val="28"/>
+          <w:szCs w:val="28"/>
+        </w:rPr>
+        <w:t xml:space="preserve"> = 33kΩ, R</w:t>
+      </w:r>
+      <w:r>
+        <w:rPr>
+          <w:rFonts w:ascii="Times New Roman" w:hAnsi="Times New Roman" w:cs="Times New Roman"/>
+          <w:sz w:val="28"/>
+          <w:szCs w:val="28"/>
+          <w:vertAlign w:val="subscript"/>
+        </w:rPr>
+        <w:t>4</w:t>
+      </w:r>
+      <w:r>
+        <w:rPr>
+          <w:rFonts w:ascii="Times New Roman" w:hAnsi="Times New Roman" w:cs="Times New Roman"/>
+          <w:sz w:val="28"/>
+          <w:szCs w:val="28"/>
+        </w:rPr>
+        <w:t xml:space="preserve"> = 33kΩ, R</w:t>
+      </w:r>
+      <w:r>
+        <w:rPr>
+          <w:rFonts w:ascii="Times New Roman" w:hAnsi="Times New Roman" w:cs="Times New Roman"/>
+          <w:sz w:val="28"/>
+          <w:szCs w:val="28"/>
+          <w:vertAlign w:val="subscript"/>
+        </w:rPr>
+        <w:t>5</w:t>
+      </w:r>
+      <w:r>
+        <w:rPr>
+          <w:rFonts w:ascii="Times New Roman" w:hAnsi="Times New Roman" w:cs="Times New Roman"/>
+          <w:sz w:val="28"/>
+          <w:szCs w:val="28"/>
+        </w:rPr>
+        <w:t xml:space="preserve"> = 33kΩ, R</w:t>
+      </w:r>
+      <w:r>
+        <w:rPr>
+          <w:rFonts w:ascii="Times New Roman" w:hAnsi="Times New Roman" w:cs="Times New Roman"/>
+          <w:sz w:val="28"/>
+          <w:szCs w:val="28"/>
+          <w:vertAlign w:val="subscript"/>
+        </w:rPr>
+        <w:t>6</w:t>
+      </w:r>
+      <w:r>
+        <w:rPr>
+          <w:rFonts w:ascii="Times New Roman" w:hAnsi="Times New Roman" w:cs="Times New Roman"/>
+          <w:sz w:val="28"/>
+          <w:szCs w:val="28"/>
+        </w:rPr>
+        <w:t xml:space="preserve"> = 2.2kΩ, R</w:t>
+      </w:r>
+      <w:r>
+        <w:rPr>
+          <w:rFonts w:ascii="Times New Roman" w:hAnsi="Times New Roman" w:cs="Times New Roman"/>
+          <w:sz w:val="28"/>
+          <w:szCs w:val="28"/>
+          <w:vertAlign w:val="subscript"/>
+        </w:rPr>
+        <w:t>7</w:t>
+      </w:r>
+      <w:r>
+        <w:rPr>
+          <w:rFonts w:ascii="Times New Roman" w:hAnsi="Times New Roman" w:cs="Times New Roman"/>
+          <w:sz w:val="28"/>
+          <w:szCs w:val="28"/>
+        </w:rPr>
+        <w:t xml:space="preserve"> = 1kΩ</w:t>
+      </w:r>
+      <w:r>
+        <w:rPr>
+          <w:rFonts w:ascii="Times New Roman" w:hAnsi="Times New Roman" w:cs="Times New Roman"/>
+          <w:sz w:val="28"/>
+          <w:szCs w:val="28"/>
+        </w:rPr>
+        <w:t xml:space="preserve"> for the resistors. </w:t>
+      </w:r>
+      <w:r>
+        <w:rPr>
+          <w:rFonts w:ascii="Times New Roman" w:hAnsi="Times New Roman" w:cs="Times New Roman"/>
+          <w:sz w:val="28"/>
+          <w:szCs w:val="28"/>
+        </w:rPr>
+        <w:t>R1 = 10kΩ and R2 = 10kΩ because they form a voltage divider between the -5V supply rail and ground to generate a stable DC reference voltage; using the voltage divider formula, R1=R2 splits the voltage in half,</w:t>
+      </w:r>
+      <w:r>
+        <w:rPr>
+          <w:rFonts w:ascii="Times New Roman" w:hAnsi="Times New Roman" w:cs="Times New Roman"/>
+          <w:sz w:val="28"/>
+          <w:szCs w:val="28"/>
+        </w:rPr>
+        <w:t xml:space="preserve"> and 10</w:t>
+      </w:r>
+      <w:r>
+        <w:rPr>
+          <w:rFonts w:ascii="Times New Roman" w:hAnsi="Times New Roman" w:cs="Times New Roman"/>
+          <w:sz w:val="28"/>
+          <w:szCs w:val="28"/>
+        </w:rPr>
+        <w:t>kΩ</w:t>
+      </w:r>
+      <w:r>
+        <w:rPr>
+          <w:rFonts w:ascii="Times New Roman" w:hAnsi="Times New Roman" w:cs="Times New Roman"/>
+          <w:sz w:val="28"/>
+          <w:szCs w:val="28"/>
+        </w:rPr>
+        <w:t xml:space="preserve"> parts were available in the lab kit. </w:t>
+      </w:r>
+      <w:r>
+        <w:rPr>
+          <w:rFonts w:ascii="Times New Roman" w:hAnsi="Times New Roman" w:cs="Times New Roman"/>
+          <w:sz w:val="28"/>
+          <w:szCs w:val="28"/>
+        </w:rPr>
+        <w:t>R3, R4, and R5 configure the final op-amp as an inverting summing amplifier. To add both inputs equally without adding extra signal gain, the ratio of the feedback resistor (R</w:t>
+      </w:r>
+      <w:r>
+        <w:rPr>
+          <w:rFonts w:ascii="Times New Roman" w:hAnsi="Times New Roman" w:cs="Times New Roman"/>
+          <w:sz w:val="28"/>
+          <w:szCs w:val="28"/>
+          <w:vertAlign w:val="subscript"/>
+        </w:rPr>
+        <w:t>4</w:t>
+      </w:r>
+      <w:r>
+        <w:rPr>
+          <w:rFonts w:ascii="Times New Roman" w:hAnsi="Times New Roman" w:cs="Times New Roman"/>
+          <w:sz w:val="28"/>
+          <w:szCs w:val="28"/>
+        </w:rPr>
+        <w:t>) to each input resistor (R</w:t>
+      </w:r>
+      <w:r>
+        <w:rPr>
+          <w:rFonts w:ascii="Times New Roman" w:hAnsi="Times New Roman" w:cs="Times New Roman"/>
+          <w:sz w:val="28"/>
+          <w:szCs w:val="28"/>
+          <w:vertAlign w:val="subscript"/>
+        </w:rPr>
+        <w:t>3</w:t>
+      </w:r>
+      <w:r>
+        <w:rPr>
+          <w:rFonts w:ascii="Times New Roman" w:hAnsi="Times New Roman" w:cs="Times New Roman"/>
+          <w:sz w:val="28"/>
+          <w:szCs w:val="28"/>
+        </w:rPr>
+        <w:t xml:space="preserve"> and R</w:t>
+      </w:r>
+      <w:r>
+        <w:rPr>
+          <w:rFonts w:ascii="Times New Roman" w:hAnsi="Times New Roman" w:cs="Times New Roman"/>
+          <w:sz w:val="28"/>
+          <w:szCs w:val="28"/>
+          <w:vertAlign w:val="subscript"/>
+        </w:rPr>
+        <w:t>5</w:t>
+      </w:r>
+      <w:r>
+        <w:rPr>
+          <w:rFonts w:ascii="Times New Roman" w:hAnsi="Times New Roman" w:cs="Times New Roman"/>
+          <w:sz w:val="28"/>
+          <w:szCs w:val="28"/>
+        </w:rPr>
+        <w:t>) must be equal to 1 since R</w:t>
+      </w:r>
+      <w:r>
+        <w:rPr>
+          <w:rFonts w:ascii="Times New Roman" w:hAnsi="Times New Roman" w:cs="Times New Roman"/>
+          <w:sz w:val="28"/>
+          <w:szCs w:val="28"/>
+          <w:vertAlign w:val="subscript"/>
+        </w:rPr>
+        <w:t>f</w:t>
+      </w:r>
+      <w:r>
+        <w:rPr>
+          <w:rFonts w:ascii="Times New Roman" w:hAnsi="Times New Roman" w:cs="Times New Roman"/>
+          <w:sz w:val="28"/>
+          <w:szCs w:val="28"/>
+        </w:rPr>
+        <w:t>/R</w:t>
+      </w:r>
+      <w:r>
+        <w:rPr>
+          <w:rFonts w:ascii="Times New Roman" w:hAnsi="Times New Roman" w:cs="Times New Roman"/>
+          <w:sz w:val="28"/>
+          <w:szCs w:val="28"/>
+          <w:vertAlign w:val="subscript"/>
+        </w:rPr>
+        <w:t>in</w:t>
+      </w:r>
+      <w:r>
+        <w:rPr>
+          <w:rFonts w:ascii="Times New Roman" w:hAnsi="Times New Roman" w:cs="Times New Roman"/>
+          <w:sz w:val="28"/>
+          <w:szCs w:val="28"/>
+        </w:rPr>
+        <w:t xml:space="preserve"> = 1. The 33</w:t>
+      </w:r>
+      <w:r>
+        <w:rPr>
+          <w:rFonts w:ascii="Times New Roman" w:hAnsi="Times New Roman" w:cs="Times New Roman"/>
+          <w:sz w:val="28"/>
+          <w:szCs w:val="28"/>
+        </w:rPr>
+        <w:t>kΩ</w:t>
+      </w:r>
+      <w:r>
+        <w:rPr>
+          <w:rFonts w:ascii="Times New Roman" w:hAnsi="Times New Roman" w:cs="Times New Roman"/>
+          <w:sz w:val="28"/>
+          <w:szCs w:val="28"/>
+        </w:rPr>
+        <w:t xml:space="preserve"> was chosen because it fit with the kit that we were given, and it was used instead of 1</w:t>
+      </w:r>
+      <w:r>
+        <w:rPr>
+          <w:rFonts w:ascii="Times New Roman" w:hAnsi="Times New Roman" w:cs="Times New Roman"/>
+          <w:sz w:val="28"/>
+          <w:szCs w:val="28"/>
+        </w:rPr>
+        <w:t>kΩ</w:t>
+      </w:r>
+      <w:r>
+        <w:rPr>
+          <w:rFonts w:ascii="Times New Roman" w:hAnsi="Times New Roman" w:cs="Times New Roman"/>
+          <w:sz w:val="28"/>
+          <w:szCs w:val="28"/>
+        </w:rPr>
+        <w:t xml:space="preserve"> to prevent clipping. R</w:t>
+      </w:r>
+      <w:r>
+        <w:rPr>
+          <w:rFonts w:ascii="Times New Roman" w:hAnsi="Times New Roman" w:cs="Times New Roman"/>
+          <w:sz w:val="28"/>
+          <w:szCs w:val="28"/>
+          <w:vertAlign w:val="subscript"/>
+        </w:rPr>
+        <w:t>7</w:t>
+      </w:r>
+      <w:r>
+        <w:rPr>
+          <w:rFonts w:ascii="Times New Roman" w:hAnsi="Times New Roman" w:cs="Times New Roman"/>
+          <w:sz w:val="28"/>
+          <w:szCs w:val="28"/>
+        </w:rPr>
+        <w:t xml:space="preserve"> and R</w:t>
+      </w:r>
+      <w:r>
+        <w:rPr>
+          <w:rFonts w:ascii="Times New Roman" w:hAnsi="Times New Roman" w:cs="Times New Roman"/>
+          <w:sz w:val="28"/>
+          <w:szCs w:val="28"/>
+          <w:vertAlign w:val="subscript"/>
+        </w:rPr>
+        <w:t>6</w:t>
+      </w:r>
+      <w:r>
+        <w:rPr>
+          <w:rFonts w:ascii="Times New Roman" w:hAnsi="Times New Roman" w:cs="Times New Roman"/>
+          <w:sz w:val="28"/>
+          <w:szCs w:val="28"/>
+        </w:rPr>
+        <w:t xml:space="preserve"> were the resistors that set the gain of the inverting amplifier stage that processes the differential output. The differential input signals have an amplitude of 0.5V and are 180 degrees out of phase, which creates a 1.0V peak-to-peak AC swing. To scale the signal so that it utilizes as much of the 0V-5V range as possible without rail-to-rail clipping, a target gain of 2.5 is needed so R</w:t>
+      </w:r>
+      <w:r>
+        <w:rPr>
+          <w:rFonts w:ascii="Times New Roman" w:hAnsi="Times New Roman" w:cs="Times New Roman"/>
+          <w:sz w:val="28"/>
+          <w:szCs w:val="28"/>
+          <w:vertAlign w:val="subscript"/>
+        </w:rPr>
+        <w:t>7</w:t>
+      </w:r>
+      <w:r>
+        <w:rPr>
+          <w:rFonts w:ascii="Times New Roman" w:hAnsi="Times New Roman" w:cs="Times New Roman"/>
+          <w:sz w:val="28"/>
+          <w:szCs w:val="28"/>
+        </w:rPr>
+        <w:t xml:space="preserve"> = 1</w:t>
+      </w:r>
+      <w:r>
+        <w:rPr>
+          <w:rFonts w:ascii="Times New Roman" w:hAnsi="Times New Roman" w:cs="Times New Roman"/>
+          <w:sz w:val="28"/>
+          <w:szCs w:val="28"/>
+        </w:rPr>
+        <w:t>kΩ</w:t>
+      </w:r>
+      <w:r>
+        <w:rPr>
+          <w:rFonts w:ascii="Times New Roman" w:hAnsi="Times New Roman" w:cs="Times New Roman"/>
+          <w:sz w:val="28"/>
+          <w:szCs w:val="28"/>
+        </w:rPr>
+        <w:t xml:space="preserve"> and R</w:t>
+      </w:r>
+      <w:r>
+        <w:rPr>
+          <w:rFonts w:ascii="Times New Roman" w:hAnsi="Times New Roman" w:cs="Times New Roman"/>
+          <w:sz w:val="28"/>
+          <w:szCs w:val="28"/>
+          <w:vertAlign w:val="subscript"/>
+        </w:rPr>
+        <w:t>6</w:t>
+      </w:r>
+      <w:r>
+        <w:rPr>
+          <w:rFonts w:ascii="Times New Roman" w:hAnsi="Times New Roman" w:cs="Times New Roman"/>
+          <w:sz w:val="28"/>
+          <w:szCs w:val="28"/>
+        </w:rPr>
+        <w:t xml:space="preserve"> = 2.2</w:t>
+      </w:r>
+      <w:r>
+        <w:rPr>
+          <w:rFonts w:ascii="Times New Roman" w:hAnsi="Times New Roman" w:cs="Times New Roman"/>
+          <w:sz w:val="28"/>
+          <w:szCs w:val="28"/>
+        </w:rPr>
+        <w:t>kΩ</w:t>
+      </w:r>
+      <w:r>
+        <w:rPr>
+          <w:rFonts w:ascii="Times New Roman" w:hAnsi="Times New Roman" w:cs="Times New Roman"/>
+          <w:sz w:val="28"/>
+          <w:szCs w:val="28"/>
+        </w:rPr>
+        <w:t xml:space="preserve"> works since gain is R</w:t>
+      </w:r>
+      <w:r>
+        <w:rPr>
+          <w:rFonts w:ascii="Times New Roman" w:hAnsi="Times New Roman" w:cs="Times New Roman"/>
+          <w:sz w:val="28"/>
+          <w:szCs w:val="28"/>
+          <w:vertAlign w:val="subscript"/>
+        </w:rPr>
+        <w:t>6</w:t>
+      </w:r>
+      <w:r>
+        <w:rPr>
+          <w:rFonts w:ascii="Times New Roman" w:hAnsi="Times New Roman" w:cs="Times New Roman"/>
+          <w:sz w:val="28"/>
+          <w:szCs w:val="28"/>
+        </w:rPr>
+        <w:t>/R</w:t>
+      </w:r>
+      <w:r>
+        <w:rPr>
+          <w:rFonts w:ascii="Times New Roman" w:hAnsi="Times New Roman" w:cs="Times New Roman"/>
+          <w:sz w:val="28"/>
+          <w:szCs w:val="28"/>
+          <w:vertAlign w:val="subscript"/>
+        </w:rPr>
+        <w:t>7</w:t>
+      </w:r>
+      <w:r>
+        <w:rPr>
+          <w:rFonts w:ascii="Times New Roman" w:hAnsi="Times New Roman" w:cs="Times New Roman"/>
+          <w:sz w:val="28"/>
+          <w:szCs w:val="28"/>
+        </w:rPr>
+        <w:t xml:space="preserve"> and would be the closest based on what we have in the toolkit. </w:t>
       </w:r>
     </w:p>
     <w:p>
@@ -7029,8 +8188,7 @@
           <w:sz w:val="24"/>
           <w:szCs w:val="24"/>
         </w:rPr>
-        <w:lastRenderedPageBreak/>
-        <w:t>fdsfsd</w:t>
+        <w:t xml:space="preserve">This lab demonstrated the application of operational amplifiers for signal conditioning tasks. By simulating and constructing buffer circuits, level shifters, and difference amplifiers, the ability to isolate circuit stages, manipulate DC offsets, and extract differential signals while rejecting common-mode noise was validated. </w:t>
       </w:r>
     </w:p>
     <w:sectPr>

</xml_diff>